<commit_message>
feat: distinct LLM narratives, blank-start dashboard, strict CGPA dial
</commit_message>
<xml_diff>
--- a/output/results.docx
+++ b/output/results.docx
@@ -24,16 +24,12 @@
         <w:pStyle w:val="Heading1"/>
       </w:pPr>
       <w:r>
-        <w:t>1. Batch Summary</w:t>
+        <w:t>1. Summary of Evaluated Candidates</w:t>
       </w:r>
     </w:p>
     <w:p>
       <w:r>
-        <w:t>• Total Resumes Ingested: 50</w:t>
-        <w:br/>
-      </w:r>
-      <w:r>
-        <w:t>• Successfully Parsed: 50</w:t>
+        <w:t>• Total Candidates Selected: 50</w:t>
         <w:br/>
       </w:r>
       <w:r>
@@ -45,7 +41,7 @@
         <w:br/>
       </w:r>
       <w:r>
-        <w:t>• Average Score (Eligible): 63.0 / 100</w:t>
+        <w:t>• Average Score (Eligible): 61.6 / 100</w:t>
         <w:br/>
       </w:r>
     </w:p>
@@ -232,7 +228,7 @@
           </w:tcPr>
           <w:p>
             <w:r>
-              <w:t>N/A</w:t>
+              <w:t>+91 73490 41840</w:t>
             </w:r>
           </w:p>
         </w:tc>
@@ -242,7 +238,7 @@
           </w:tcPr>
           <w:p>
             <w:r>
-              <w:t>88.5</w:t>
+              <w:t>91.0</w:t>
             </w:r>
           </w:p>
         </w:tc>
@@ -265,130 +261,6 @@
           <w:p>
             <w:r>
               <w:t>#3</w:t>
-            </w:r>
-          </w:p>
-        </w:tc>
-        <w:tc>
-          <w:tcPr>
-            <w:tcW w:type="dxa" w:w="1440"/>
-          </w:tcPr>
-          <w:p>
-            <w:r>
-              <w:t>Sumaiya Sultana Shaik</w:t>
-            </w:r>
-          </w:p>
-        </w:tc>
-        <w:tc>
-          <w:tcPr>
-            <w:tcW w:type="dxa" w:w="1440"/>
-          </w:tcPr>
-          <w:p>
-            <w:r>
-              <w:t>sultanasumaiya623@gmail.com</w:t>
-            </w:r>
-          </w:p>
-        </w:tc>
-        <w:tc>
-          <w:tcPr>
-            <w:tcW w:type="dxa" w:w="1440"/>
-          </w:tcPr>
-          <w:p>
-            <w:r>
-              <w:t>N/A</w:t>
-            </w:r>
-          </w:p>
-        </w:tc>
-        <w:tc>
-          <w:tcPr>
-            <w:tcW w:type="dxa" w:w="1440"/>
-          </w:tcPr>
-          <w:p>
-            <w:r>
-              <w:t>82.5</w:t>
-            </w:r>
-          </w:p>
-        </w:tc>
-        <w:tc>
-          <w:tcPr>
-            <w:tcW w:type="dxa" w:w="1440"/>
-          </w:tcPr>
-          <w:p>
-            <w:r>
-              <w:t>Active Builder</w:t>
-            </w:r>
-          </w:p>
-        </w:tc>
-      </w:tr>
-      <w:tr>
-        <w:tc>
-          <w:tcPr>
-            <w:tcW w:type="dxa" w:w="1440"/>
-          </w:tcPr>
-          <w:p>
-            <w:r>
-              <w:t>#4</w:t>
-            </w:r>
-          </w:p>
-        </w:tc>
-        <w:tc>
-          <w:tcPr>
-            <w:tcW w:type="dxa" w:w="1440"/>
-          </w:tcPr>
-          <w:p>
-            <w:r>
-              <w:t>Arjun Kumar</w:t>
-            </w:r>
-          </w:p>
-        </w:tc>
-        <w:tc>
-          <w:tcPr>
-            <w:tcW w:type="dxa" w:w="1440"/>
-          </w:tcPr>
-          <w:p>
-            <w:r>
-              <w:t>roy.prajapat.143@gmail.com</w:t>
-            </w:r>
-          </w:p>
-        </w:tc>
-        <w:tc>
-          <w:tcPr>
-            <w:tcW w:type="dxa" w:w="1440"/>
-          </w:tcPr>
-          <w:p>
-            <w:r>
-              <w:t>+91-6396303191</w:t>
-            </w:r>
-          </w:p>
-        </w:tc>
-        <w:tc>
-          <w:tcPr>
-            <w:tcW w:type="dxa" w:w="1440"/>
-          </w:tcPr>
-          <w:p>
-            <w:r>
-              <w:t>81.5</w:t>
-            </w:r>
-          </w:p>
-        </w:tc>
-        <w:tc>
-          <w:tcPr>
-            <w:tcW w:type="dxa" w:w="1440"/>
-          </w:tcPr>
-          <w:p>
-            <w:r>
-              <w:t>Veteran Builder</w:t>
-            </w:r>
-          </w:p>
-        </w:tc>
-      </w:tr>
-      <w:tr>
-        <w:tc>
-          <w:tcPr>
-            <w:tcW w:type="dxa" w:w="1440"/>
-          </w:tcPr>
-          <w:p>
-            <w:r>
-              <w:t>#5</w:t>
             </w:r>
           </w:p>
         </w:tc>
@@ -450,69 +322,7 @@
           </w:tcPr>
           <w:p>
             <w:r>
-              <w:t>#6</w:t>
-            </w:r>
-          </w:p>
-        </w:tc>
-        <w:tc>
-          <w:tcPr>
-            <w:tcW w:type="dxa" w:w="1440"/>
-          </w:tcPr>
-          <w:p>
-            <w:r>
-              <w:t>Yash Maini</w:t>
-            </w:r>
-          </w:p>
-        </w:tc>
-        <w:tc>
-          <w:tcPr>
-            <w:tcW w:type="dxa" w:w="1440"/>
-          </w:tcPr>
-          <w:p>
-            <w:r>
-              <w:t>mainiyash2@gmail.com</w:t>
-            </w:r>
-          </w:p>
-        </w:tc>
-        <w:tc>
-          <w:tcPr>
-            <w:tcW w:type="dxa" w:w="1440"/>
-          </w:tcPr>
-          <w:p>
-            <w:r>
-              <w:t>+91-8920028757</w:t>
-            </w:r>
-          </w:p>
-        </w:tc>
-        <w:tc>
-          <w:tcPr>
-            <w:tcW w:type="dxa" w:w="1440"/>
-          </w:tcPr>
-          <w:p>
-            <w:r>
-              <w:t>78.0</w:t>
-            </w:r>
-          </w:p>
-        </w:tc>
-        <w:tc>
-          <w:tcPr>
-            <w:tcW w:type="dxa" w:w="1440"/>
-          </w:tcPr>
-          <w:p>
-            <w:r>
-              <w:t>Veteran Builder</w:t>
-            </w:r>
-          </w:p>
-        </w:tc>
-      </w:tr>
-      <w:tr>
-        <w:tc>
-          <w:tcPr>
-            <w:tcW w:type="dxa" w:w="1440"/>
-          </w:tcPr>
-          <w:p>
-            <w:r>
-              <w:t>#7</w:t>
+              <w:t>#4</w:t>
             </w:r>
           </w:p>
         </w:tc>
@@ -574,7 +384,7 @@
           </w:tcPr>
           <w:p>
             <w:r>
-              <w:t>#8</w:t>
+              <w:t>#5</w:t>
             </w:r>
           </w:p>
         </w:tc>
@@ -636,7 +446,7 @@
           </w:tcPr>
           <w:p>
             <w:r>
-              <w:t>#9</w:t>
+              <w:t>#6</w:t>
             </w:r>
           </w:p>
         </w:tc>
@@ -698,7 +508,7 @@
           </w:tcPr>
           <w:p>
             <w:r>
-              <w:t>#10</w:t>
+              <w:t>#7</w:t>
             </w:r>
           </w:p>
         </w:tc>
@@ -760,7 +570,7 @@
           </w:tcPr>
           <w:p>
             <w:r>
-              <w:t>#11</w:t>
+              <w:t>#8</w:t>
             </w:r>
           </w:p>
         </w:tc>
@@ -770,7 +580,7 @@
           </w:tcPr>
           <w:p>
             <w:r>
-              <w:t>Jyandeep Baishya</w:t>
+              <w:t>Sumaiya Sultana Shaik</w:t>
             </w:r>
           </w:p>
         </w:tc>
@@ -780,7 +590,7 @@
           </w:tcPr>
           <w:p>
             <w:r>
-              <w:t>craftzyan@gmail.com</w:t>
+              <w:t>sultanasumaiya623@gmail.com</w:t>
             </w:r>
           </w:p>
         </w:tc>
@@ -790,7 +600,7 @@
           </w:tcPr>
           <w:p>
             <w:r>
-              <w:t>6002590335</w:t>
+              <w:t>+91 97015 28467</w:t>
             </w:r>
           </w:p>
         </w:tc>
@@ -800,7 +610,7 @@
           </w:tcPr>
           <w:p>
             <w:r>
-              <w:t>73.0</w:t>
+              <w:t>72.5</w:t>
             </w:r>
           </w:p>
         </w:tc>
@@ -810,7 +620,7 @@
           </w:tcPr>
           <w:p>
             <w:r>
-              <w:t>Veteran Builder</w:t>
+              <w:t>Unverified (Rate Limited)</w:t>
             </w:r>
           </w:p>
         </w:tc>
@@ -822,7 +632,69 @@
           </w:tcPr>
           <w:p>
             <w:r>
-              <w:t>#12</w:t>
+              <w:t>#9</w:t>
+            </w:r>
+          </w:p>
+        </w:tc>
+        <w:tc>
+          <w:tcPr>
+            <w:tcW w:type="dxa" w:w="1440"/>
+          </w:tcPr>
+          <w:p>
+            <w:r>
+              <w:t>Arjun Kumar</w:t>
+            </w:r>
+          </w:p>
+        </w:tc>
+        <w:tc>
+          <w:tcPr>
+            <w:tcW w:type="dxa" w:w="1440"/>
+          </w:tcPr>
+          <w:p>
+            <w:r>
+              <w:t>roy.prajapat.143@gmail.com</w:t>
+            </w:r>
+          </w:p>
+        </w:tc>
+        <w:tc>
+          <w:tcPr>
+            <w:tcW w:type="dxa" w:w="1440"/>
+          </w:tcPr>
+          <w:p>
+            <w:r>
+              <w:t>+91-6396303191</w:t>
+            </w:r>
+          </w:p>
+        </w:tc>
+        <w:tc>
+          <w:tcPr>
+            <w:tcW w:type="dxa" w:w="1440"/>
+          </w:tcPr>
+          <w:p>
+            <w:r>
+              <w:t>71.5</w:t>
+            </w:r>
+          </w:p>
+        </w:tc>
+        <w:tc>
+          <w:tcPr>
+            <w:tcW w:type="dxa" w:w="1440"/>
+          </w:tcPr>
+          <w:p>
+            <w:r>
+              <w:t>Unverified (Rate Limited)</w:t>
+            </w:r>
+          </w:p>
+        </w:tc>
+      </w:tr>
+      <w:tr>
+        <w:tc>
+          <w:tcPr>
+            <w:tcW w:type="dxa" w:w="1440"/>
+          </w:tcPr>
+          <w:p>
+            <w:r>
+              <w:t>#10</w:t>
             </w:r>
           </w:p>
         </w:tc>
@@ -884,69 +756,7 @@
           </w:tcPr>
           <w:p>
             <w:r>
-              <w:t>#13</w:t>
-            </w:r>
-          </w:p>
-        </w:tc>
-        <w:tc>
-          <w:tcPr>
-            <w:tcW w:type="dxa" w:w="1440"/>
-          </w:tcPr>
-          <w:p>
-            <w:r>
-              <w:t>Krishan Kant</w:t>
-            </w:r>
-          </w:p>
-        </w:tc>
-        <w:tc>
-          <w:tcPr>
-            <w:tcW w:type="dxa" w:w="1440"/>
-          </w:tcPr>
-          <w:p>
-            <w:r>
-              <w:t>krishankantptu@gmail.com</w:t>
-            </w:r>
-          </w:p>
-        </w:tc>
-        <w:tc>
-          <w:tcPr>
-            <w:tcW w:type="dxa" w:w="1440"/>
-          </w:tcPr>
-          <w:p>
-            <w:r>
-              <w:t>+91-6204142591</w:t>
-            </w:r>
-          </w:p>
-        </w:tc>
-        <w:tc>
-          <w:tcPr>
-            <w:tcW w:type="dxa" w:w="1440"/>
-          </w:tcPr>
-          <w:p>
-            <w:r>
-              <w:t>69.5</w:t>
-            </w:r>
-          </w:p>
-        </w:tc>
-        <w:tc>
-          <w:tcPr>
-            <w:tcW w:type="dxa" w:w="1440"/>
-          </w:tcPr>
-          <w:p>
-            <w:r>
-              <w:t>Veteran Builder</w:t>
-            </w:r>
-          </w:p>
-        </w:tc>
-      </w:tr>
-      <w:tr>
-        <w:tc>
-          <w:tcPr>
-            <w:tcW w:type="dxa" w:w="1440"/>
-          </w:tcPr>
-          <w:p>
-            <w:r>
-              <w:t>#14</w:t>
+              <w:t>#11</w:t>
             </w:r>
           </w:p>
         </w:tc>
@@ -1008,7 +818,69 @@
           </w:tcPr>
           <w:p>
             <w:r>
-              <w:t>#15</w:t>
+              <w:t>#12</w:t>
+            </w:r>
+          </w:p>
+        </w:tc>
+        <w:tc>
+          <w:tcPr>
+            <w:tcW w:type="dxa" w:w="1440"/>
+          </w:tcPr>
+          <w:p>
+            <w:r>
+              <w:t>Yash Maini</w:t>
+            </w:r>
+          </w:p>
+        </w:tc>
+        <w:tc>
+          <w:tcPr>
+            <w:tcW w:type="dxa" w:w="1440"/>
+          </w:tcPr>
+          <w:p>
+            <w:r>
+              <w:t>mainiyash2@gmail.com</w:t>
+            </w:r>
+          </w:p>
+        </w:tc>
+        <w:tc>
+          <w:tcPr>
+            <w:tcW w:type="dxa" w:w="1440"/>
+          </w:tcPr>
+          <w:p>
+            <w:r>
+              <w:t>+91-8920028757</w:t>
+            </w:r>
+          </w:p>
+        </w:tc>
+        <w:tc>
+          <w:tcPr>
+            <w:tcW w:type="dxa" w:w="1440"/>
+          </w:tcPr>
+          <w:p>
+            <w:r>
+              <w:t>68.0</w:t>
+            </w:r>
+          </w:p>
+        </w:tc>
+        <w:tc>
+          <w:tcPr>
+            <w:tcW w:type="dxa" w:w="1440"/>
+          </w:tcPr>
+          <w:p>
+            <w:r>
+              <w:t>Unverified (Rate Limited)</w:t>
+            </w:r>
+          </w:p>
+        </w:tc>
+      </w:tr>
+      <w:tr>
+        <w:tc>
+          <w:tcPr>
+            <w:tcW w:type="dxa" w:w="1440"/>
+          </w:tcPr>
+          <w:p>
+            <w:r>
+              <w:t>#13</w:t>
             </w:r>
           </w:p>
         </w:tc>
@@ -1048,7 +920,7 @@
           </w:tcPr>
           <w:p>
             <w:r>
-              <w:t>65.0</w:t>
+              <w:t>68.0</w:t>
             </w:r>
           </w:p>
         </w:tc>
@@ -1058,7 +930,131 @@
           </w:tcPr>
           <w:p>
             <w:r>
-              <w:t>Active Developer</w:t>
+              <w:t>Active Builder</w:t>
+            </w:r>
+          </w:p>
+        </w:tc>
+      </w:tr>
+      <w:tr>
+        <w:tc>
+          <w:tcPr>
+            <w:tcW w:type="dxa" w:w="1440"/>
+          </w:tcPr>
+          <w:p>
+            <w:r>
+              <w:t>#14</w:t>
+            </w:r>
+          </w:p>
+        </w:tc>
+        <w:tc>
+          <w:tcPr>
+            <w:tcW w:type="dxa" w:w="1440"/>
+          </w:tcPr>
+          <w:p>
+            <w:r>
+              <w:t>Jyandeep Baishya</w:t>
+            </w:r>
+          </w:p>
+        </w:tc>
+        <w:tc>
+          <w:tcPr>
+            <w:tcW w:type="dxa" w:w="1440"/>
+          </w:tcPr>
+          <w:p>
+            <w:r>
+              <w:t>craftzyan@gmail.com</w:t>
+            </w:r>
+          </w:p>
+        </w:tc>
+        <w:tc>
+          <w:tcPr>
+            <w:tcW w:type="dxa" w:w="1440"/>
+          </w:tcPr>
+          <w:p>
+            <w:r>
+              <w:t>6002590335</w:t>
+            </w:r>
+          </w:p>
+        </w:tc>
+        <w:tc>
+          <w:tcPr>
+            <w:tcW w:type="dxa" w:w="1440"/>
+          </w:tcPr>
+          <w:p>
+            <w:r>
+              <w:t>63.0</w:t>
+            </w:r>
+          </w:p>
+        </w:tc>
+        <w:tc>
+          <w:tcPr>
+            <w:tcW w:type="dxa" w:w="1440"/>
+          </w:tcPr>
+          <w:p>
+            <w:r>
+              <w:t>Unverified (Rate Limited)</w:t>
+            </w:r>
+          </w:p>
+        </w:tc>
+      </w:tr>
+      <w:tr>
+        <w:tc>
+          <w:tcPr>
+            <w:tcW w:type="dxa" w:w="1440"/>
+          </w:tcPr>
+          <w:p>
+            <w:r>
+              <w:t>#15</w:t>
+            </w:r>
+          </w:p>
+        </w:tc>
+        <w:tc>
+          <w:tcPr>
+            <w:tcW w:type="dxa" w:w="1440"/>
+          </w:tcPr>
+          <w:p>
+            <w:r>
+              <w:t>M Sai Kushith</w:t>
+            </w:r>
+          </w:p>
+        </w:tc>
+        <w:tc>
+          <w:tcPr>
+            <w:tcW w:type="dxa" w:w="1440"/>
+          </w:tcPr>
+          <w:p>
+            <w:r>
+              <w:t>msaikushith718@gmail.com</w:t>
+            </w:r>
+          </w:p>
+        </w:tc>
+        <w:tc>
+          <w:tcPr>
+            <w:tcW w:type="dxa" w:w="1440"/>
+          </w:tcPr>
+          <w:p>
+            <w:r>
+              <w:t>+91-7842732706</w:t>
+            </w:r>
+          </w:p>
+        </w:tc>
+        <w:tc>
+          <w:tcPr>
+            <w:tcW w:type="dxa" w:w="1440"/>
+          </w:tcPr>
+          <w:p>
+            <w:r>
+              <w:t>61.0</w:t>
+            </w:r>
+          </w:p>
+        </w:tc>
+        <w:tc>
+          <w:tcPr>
+            <w:tcW w:type="dxa" w:w="1440"/>
+          </w:tcPr>
+          <w:p>
+            <w:r>
+              <w:t>Active Builder</w:t>
             </w:r>
           </w:p>
         </w:tc>
@@ -1080,7 +1076,7 @@
           </w:tcPr>
           <w:p>
             <w:r>
-              <w:t>Priyanshu Kumar</w:t>
+              <w:t>Krishan Kant</w:t>
             </w:r>
           </w:p>
         </w:tc>
@@ -1090,7 +1086,7 @@
           </w:tcPr>
           <w:p>
             <w:r>
-              <w:t>krpriyanshu2805@gmail.com</w:t>
+              <w:t>krishankantptu@gmail.com</w:t>
             </w:r>
           </w:p>
         </w:tc>
@@ -1100,7 +1096,7 @@
           </w:tcPr>
           <w:p>
             <w:r>
-              <w:t>+91 8210008947</w:t>
+              <w:t>+91-6204142591</w:t>
             </w:r>
           </w:p>
         </w:tc>
@@ -1110,7 +1106,7 @@
           </w:tcPr>
           <w:p>
             <w:r>
-              <w:t>60.5</w:t>
+              <w:t>61.0</w:t>
             </w:r>
           </w:p>
         </w:tc>
@@ -1120,7 +1116,7 @@
           </w:tcPr>
           <w:p>
             <w:r>
-              <w:t>Active Developer</w:t>
+              <w:t>Unverified (Rate Limited)</w:t>
             </w:r>
           </w:p>
         </w:tc>
@@ -1204,130 +1200,6 @@
           </w:tcPr>
           <w:p>
             <w:r>
-              <w:t>P V Jayavardhana Sai</w:t>
-            </w:r>
-          </w:p>
-        </w:tc>
-        <w:tc>
-          <w:tcPr>
-            <w:tcW w:type="dxa" w:w="1440"/>
-          </w:tcPr>
-          <w:p>
-            <w:r>
-              <w:t>pvjayavardhan6@gmail.com</w:t>
-            </w:r>
-          </w:p>
-        </w:tc>
-        <w:tc>
-          <w:tcPr>
-            <w:tcW w:type="dxa" w:w="1440"/>
-          </w:tcPr>
-          <w:p>
-            <w:r>
-              <w:t>N/A</w:t>
-            </w:r>
-          </w:p>
-        </w:tc>
-        <w:tc>
-          <w:tcPr>
-            <w:tcW w:type="dxa" w:w="1440"/>
-          </w:tcPr>
-          <w:p>
-            <w:r>
-              <w:t>59.5</w:t>
-            </w:r>
-          </w:p>
-        </w:tc>
-        <w:tc>
-          <w:tcPr>
-            <w:tcW w:type="dxa" w:w="1440"/>
-          </w:tcPr>
-          <w:p>
-            <w:r>
-              <w:t>Active Developer</w:t>
-            </w:r>
-          </w:p>
-        </w:tc>
-      </w:tr>
-      <w:tr>
-        <w:tc>
-          <w:tcPr>
-            <w:tcW w:type="dxa" w:w="1440"/>
-          </w:tcPr>
-          <w:p>
-            <w:r>
-              <w:t>#19</w:t>
-            </w:r>
-          </w:p>
-        </w:tc>
-        <w:tc>
-          <w:tcPr>
-            <w:tcW w:type="dxa" w:w="1440"/>
-          </w:tcPr>
-          <w:p>
-            <w:r>
-              <w:t>M Sai Kushith</w:t>
-            </w:r>
-          </w:p>
-        </w:tc>
-        <w:tc>
-          <w:tcPr>
-            <w:tcW w:type="dxa" w:w="1440"/>
-          </w:tcPr>
-          <w:p>
-            <w:r>
-              <w:t>msaikushith718@gmail.com</w:t>
-            </w:r>
-          </w:p>
-        </w:tc>
-        <w:tc>
-          <w:tcPr>
-            <w:tcW w:type="dxa" w:w="1440"/>
-          </w:tcPr>
-          <w:p>
-            <w:r>
-              <w:t>+91-7842732706</w:t>
-            </w:r>
-          </w:p>
-        </w:tc>
-        <w:tc>
-          <w:tcPr>
-            <w:tcW w:type="dxa" w:w="1440"/>
-          </w:tcPr>
-          <w:p>
-            <w:r>
-              <w:t>58.5</w:t>
-            </w:r>
-          </w:p>
-        </w:tc>
-        <w:tc>
-          <w:tcPr>
-            <w:tcW w:type="dxa" w:w="1440"/>
-          </w:tcPr>
-          <w:p>
-            <w:r>
-              <w:t>Active Developer</w:t>
-            </w:r>
-          </w:p>
-        </w:tc>
-      </w:tr>
-      <w:tr>
-        <w:tc>
-          <w:tcPr>
-            <w:tcW w:type="dxa" w:w="1440"/>
-          </w:tcPr>
-          <w:p>
-            <w:r>
-              <w:t>#20</w:t>
-            </w:r>
-          </w:p>
-        </w:tc>
-        <w:tc>
-          <w:tcPr>
-            <w:tcW w:type="dxa" w:w="1440"/>
-          </w:tcPr>
-          <w:p>
-            <w:r>
               <w:t>Thejeshwaar Paasila</w:t>
             </w:r>
           </w:p>
@@ -1358,7 +1230,7 @@
           </w:tcPr>
           <w:p>
             <w:r>
-              <w:t>56.5</w:t>
+              <w:t>59.5</w:t>
             </w:r>
           </w:p>
         </w:tc>
@@ -1380,69 +1252,7 @@
           </w:tcPr>
           <w:p>
             <w:r>
-              <w:t>#21</w:t>
-            </w:r>
-          </w:p>
-        </w:tc>
-        <w:tc>
-          <w:tcPr>
-            <w:tcW w:type="dxa" w:w="1440"/>
-          </w:tcPr>
-          <w:p>
-            <w:r>
-              <w:t>Shubhanshu Navadiya</w:t>
-            </w:r>
-          </w:p>
-        </w:tc>
-        <w:tc>
-          <w:tcPr>
-            <w:tcW w:type="dxa" w:w="1440"/>
-          </w:tcPr>
-          <w:p>
-            <w:r>
-              <w:t>subhnavadiya@gmail.com</w:t>
-            </w:r>
-          </w:p>
-        </w:tc>
-        <w:tc>
-          <w:tcPr>
-            <w:tcW w:type="dxa" w:w="1440"/>
-          </w:tcPr>
-          <w:p>
-            <w:r>
-              <w:t>+91 9031132507</w:t>
-            </w:r>
-          </w:p>
-        </w:tc>
-        <w:tc>
-          <w:tcPr>
-            <w:tcW w:type="dxa" w:w="1440"/>
-          </w:tcPr>
-          <w:p>
-            <w:r>
-              <w:t>56.0</w:t>
-            </w:r>
-          </w:p>
-        </w:tc>
-        <w:tc>
-          <w:tcPr>
-            <w:tcW w:type="dxa" w:w="1440"/>
-          </w:tcPr>
-          <w:p>
-            <w:r>
-              <w:t>Active Developer</w:t>
-            </w:r>
-          </w:p>
-        </w:tc>
-      </w:tr>
-      <w:tr>
-        <w:tc>
-          <w:tcPr>
-            <w:tcW w:type="dxa" w:w="1440"/>
-          </w:tcPr>
-          <w:p>
-            <w:r>
-              <w:t>#22</w:t>
+              <w:t>#19</w:t>
             </w:r>
           </w:p>
         </w:tc>
@@ -1482,6 +1292,192 @@
           </w:tcPr>
           <w:p>
             <w:r>
+              <w:t>59.0</w:t>
+            </w:r>
+          </w:p>
+        </w:tc>
+        <w:tc>
+          <w:tcPr>
+            <w:tcW w:type="dxa" w:w="1440"/>
+          </w:tcPr>
+          <w:p>
+            <w:r>
+              <w:t>Veteran Builder</w:t>
+            </w:r>
+          </w:p>
+        </w:tc>
+      </w:tr>
+      <w:tr>
+        <w:tc>
+          <w:tcPr>
+            <w:tcW w:type="dxa" w:w="1440"/>
+          </w:tcPr>
+          <w:p>
+            <w:r>
+              <w:t>#20</w:t>
+            </w:r>
+          </w:p>
+        </w:tc>
+        <w:tc>
+          <w:tcPr>
+            <w:tcW w:type="dxa" w:w="1440"/>
+          </w:tcPr>
+          <w:p>
+            <w:r>
+              <w:t>Pavani A</w:t>
+            </w:r>
+          </w:p>
+        </w:tc>
+        <w:tc>
+          <w:tcPr>
+            <w:tcW w:type="dxa" w:w="1440"/>
+          </w:tcPr>
+          <w:p>
+            <w:r>
+              <w:t>pavani10112004@gmail.com</w:t>
+            </w:r>
+          </w:p>
+        </w:tc>
+        <w:tc>
+          <w:tcPr>
+            <w:tcW w:type="dxa" w:w="1440"/>
+          </w:tcPr>
+          <w:p>
+            <w:r>
+              <w:t>+919742542200</w:t>
+            </w:r>
+          </w:p>
+        </w:tc>
+        <w:tc>
+          <w:tcPr>
+            <w:tcW w:type="dxa" w:w="1440"/>
+          </w:tcPr>
+          <w:p>
+            <w:r>
+              <w:t>58.0</w:t>
+            </w:r>
+          </w:p>
+        </w:tc>
+        <w:tc>
+          <w:tcPr>
+            <w:tcW w:type="dxa" w:w="1440"/>
+          </w:tcPr>
+          <w:p>
+            <w:r>
+              <w:t>Active Builder</w:t>
+            </w:r>
+          </w:p>
+        </w:tc>
+      </w:tr>
+      <w:tr>
+        <w:tc>
+          <w:tcPr>
+            <w:tcW w:type="dxa" w:w="1440"/>
+          </w:tcPr>
+          <w:p>
+            <w:r>
+              <w:t>#21</w:t>
+            </w:r>
+          </w:p>
+        </w:tc>
+        <w:tc>
+          <w:tcPr>
+            <w:tcW w:type="dxa" w:w="1440"/>
+          </w:tcPr>
+          <w:p>
+            <w:r>
+              <w:t>Aditi Kala</w:t>
+            </w:r>
+          </w:p>
+        </w:tc>
+        <w:tc>
+          <w:tcPr>
+            <w:tcW w:type="dxa" w:w="1440"/>
+          </w:tcPr>
+          <w:p>
+            <w:r>
+              <w:t>aditi25.kala@gmail.com</w:t>
+            </w:r>
+          </w:p>
+        </w:tc>
+        <w:tc>
+          <w:tcPr>
+            <w:tcW w:type="dxa" w:w="1440"/>
+          </w:tcPr>
+          <w:p>
+            <w:r>
+              <w:t>+91-8368407039</w:t>
+            </w:r>
+          </w:p>
+        </w:tc>
+        <w:tc>
+          <w:tcPr>
+            <w:tcW w:type="dxa" w:w="1440"/>
+          </w:tcPr>
+          <w:p>
+            <w:r>
+              <w:t>58.0</w:t>
+            </w:r>
+          </w:p>
+        </w:tc>
+        <w:tc>
+          <w:tcPr>
+            <w:tcW w:type="dxa" w:w="1440"/>
+          </w:tcPr>
+          <w:p>
+            <w:r>
+              <w:t>Veteran Builder</w:t>
+            </w:r>
+          </w:p>
+        </w:tc>
+      </w:tr>
+      <w:tr>
+        <w:tc>
+          <w:tcPr>
+            <w:tcW w:type="dxa" w:w="1440"/>
+          </w:tcPr>
+          <w:p>
+            <w:r>
+              <w:t>#22</w:t>
+            </w:r>
+          </w:p>
+        </w:tc>
+        <w:tc>
+          <w:tcPr>
+            <w:tcW w:type="dxa" w:w="1440"/>
+          </w:tcPr>
+          <w:p>
+            <w:r>
+              <w:t>Priyanshu Kumar</w:t>
+            </w:r>
+          </w:p>
+        </w:tc>
+        <w:tc>
+          <w:tcPr>
+            <w:tcW w:type="dxa" w:w="1440"/>
+          </w:tcPr>
+          <w:p>
+            <w:r>
+              <w:t>krpriyanshu2805@gmail.com</w:t>
+            </w:r>
+          </w:p>
+        </w:tc>
+        <w:tc>
+          <w:tcPr>
+            <w:tcW w:type="dxa" w:w="1440"/>
+          </w:tcPr>
+          <w:p>
+            <w:r>
+              <w:t>+91 8210008947</w:t>
+            </w:r>
+          </w:p>
+        </w:tc>
+        <w:tc>
+          <w:tcPr>
+            <w:tcW w:type="dxa" w:w="1440"/>
+          </w:tcPr>
+          <w:p>
+            <w:r>
               <w:t>55.5</w:t>
             </w:r>
           </w:p>
@@ -1505,6 +1501,68 @@
           <w:p>
             <w:r>
               <w:t>#23</w:t>
+            </w:r>
+          </w:p>
+        </w:tc>
+        <w:tc>
+          <w:tcPr>
+            <w:tcW w:type="dxa" w:w="1440"/>
+          </w:tcPr>
+          <w:p>
+            <w:r>
+              <w:t>P V Jayavardhana Sai</w:t>
+            </w:r>
+          </w:p>
+        </w:tc>
+        <w:tc>
+          <w:tcPr>
+            <w:tcW w:type="dxa" w:w="1440"/>
+          </w:tcPr>
+          <w:p>
+            <w:r>
+              <w:t>pvjayavardhan6@gmail.com</w:t>
+            </w:r>
+          </w:p>
+        </w:tc>
+        <w:tc>
+          <w:tcPr>
+            <w:tcW w:type="dxa" w:w="1440"/>
+          </w:tcPr>
+          <w:p>
+            <w:r>
+              <w:t>+91 99663 46173</w:t>
+            </w:r>
+          </w:p>
+        </w:tc>
+        <w:tc>
+          <w:tcPr>
+            <w:tcW w:type="dxa" w:w="1440"/>
+          </w:tcPr>
+          <w:p>
+            <w:r>
+              <w:t>54.5</w:t>
+            </w:r>
+          </w:p>
+        </w:tc>
+        <w:tc>
+          <w:tcPr>
+            <w:tcW w:type="dxa" w:w="1440"/>
+          </w:tcPr>
+          <w:p>
+            <w:r>
+              <w:t>Unverified (Rate Limited)</w:t>
+            </w:r>
+          </w:p>
+        </w:tc>
+      </w:tr>
+      <w:tr>
+        <w:tc>
+          <w:tcPr>
+            <w:tcW w:type="dxa" w:w="1440"/>
+          </w:tcPr>
+          <w:p>
+            <w:r>
+              <w:t>#24</w:t>
             </w:r>
           </w:p>
         </w:tc>
@@ -1566,7 +1624,7 @@
           </w:tcPr>
           <w:p>
             <w:r>
-              <w:t>#24</w:t>
+              <w:t>#25</w:t>
             </w:r>
           </w:p>
         </w:tc>
@@ -1596,7 +1654,7 @@
           </w:tcPr>
           <w:p>
             <w:r>
-              <w:t>N/A</w:t>
+              <w:t>+91-9113869665</w:t>
             </w:r>
           </w:p>
         </w:tc>
@@ -1628,68 +1686,6 @@
           </w:tcPr>
           <w:p>
             <w:r>
-              <w:t>#25</w:t>
-            </w:r>
-          </w:p>
-        </w:tc>
-        <w:tc>
-          <w:tcPr>
-            <w:tcW w:type="dxa" w:w="1440"/>
-          </w:tcPr>
-          <w:p>
-            <w:r>
-              <w:t>Aditi Kala</w:t>
-            </w:r>
-          </w:p>
-        </w:tc>
-        <w:tc>
-          <w:tcPr>
-            <w:tcW w:type="dxa" w:w="1440"/>
-          </w:tcPr>
-          <w:p>
-            <w:r>
-              <w:t>aditi25.kala@gmail.com</w:t>
-            </w:r>
-          </w:p>
-        </w:tc>
-        <w:tc>
-          <w:tcPr>
-            <w:tcW w:type="dxa" w:w="1440"/>
-          </w:tcPr>
-          <w:p>
-            <w:r>
-              <w:t>+91-8368407039</w:t>
-            </w:r>
-          </w:p>
-        </w:tc>
-        <w:tc>
-          <w:tcPr>
-            <w:tcW w:type="dxa" w:w="1440"/>
-          </w:tcPr>
-          <w:p>
-            <w:r>
-              <w:t>52.0</w:t>
-            </w:r>
-          </w:p>
-        </w:tc>
-        <w:tc>
-          <w:tcPr>
-            <w:tcW w:type="dxa" w:w="1440"/>
-          </w:tcPr>
-          <w:p>
-            <w:r>
-              <w:t>Unverified (Rate Limited)</w:t>
-            </w:r>
-          </w:p>
-        </w:tc>
-      </w:tr>
-      <w:tr>
-        <w:tc>
-          <w:tcPr>
-            <w:tcW w:type="dxa" w:w="1440"/>
-          </w:tcPr>
-          <w:p>
-            <w:r>
               <w:t>#26</w:t>
             </w:r>
           </w:p>
@@ -1700,7 +1696,7 @@
           </w:tcPr>
           <w:p>
             <w:r>
-              <w:t>Pavani A</w:t>
+              <w:t>Shubhanshu Navadiya</w:t>
             </w:r>
           </w:p>
         </w:tc>
@@ -1710,7 +1706,7 @@
           </w:tcPr>
           <w:p>
             <w:r>
-              <w:t>pavani10112004@gmail.com</w:t>
+              <w:t>subhnavadiya@gmail.com</w:t>
             </w:r>
           </w:p>
         </w:tc>
@@ -1720,7 +1716,7 @@
           </w:tcPr>
           <w:p>
             <w:r>
-              <w:t>N/A</w:t>
+              <w:t>+91 9031132507</w:t>
             </w:r>
           </w:p>
         </w:tc>
@@ -1730,7 +1726,7 @@
           </w:tcPr>
           <w:p>
             <w:r>
-              <w:t>52.0</w:t>
+              <w:t>51.0</w:t>
             </w:r>
           </w:p>
         </w:tc>
@@ -1824,6 +1820,130 @@
           </w:tcPr>
           <w:p>
             <w:r>
+              <w:t>Annisha S</w:t>
+            </w:r>
+          </w:p>
+        </w:tc>
+        <w:tc>
+          <w:tcPr>
+            <w:tcW w:type="dxa" w:w="1440"/>
+          </w:tcPr>
+          <w:p>
+            <w:r>
+              <w:t>annishasaravanan83@gmail.com</w:t>
+            </w:r>
+          </w:p>
+        </w:tc>
+        <w:tc>
+          <w:tcPr>
+            <w:tcW w:type="dxa" w:w="1440"/>
+          </w:tcPr>
+          <w:p>
+            <w:r>
+              <w:t>9361112081</w:t>
+            </w:r>
+          </w:p>
+        </w:tc>
+        <w:tc>
+          <w:tcPr>
+            <w:tcW w:type="dxa" w:w="1440"/>
+          </w:tcPr>
+          <w:p>
+            <w:r>
+              <w:t>43.0</w:t>
+            </w:r>
+          </w:p>
+        </w:tc>
+        <w:tc>
+          <w:tcPr>
+            <w:tcW w:type="dxa" w:w="1440"/>
+          </w:tcPr>
+          <w:p>
+            <w:r>
+              <w:t>Unverified (Rate Limited)</w:t>
+            </w:r>
+          </w:p>
+        </w:tc>
+      </w:tr>
+      <w:tr>
+        <w:tc>
+          <w:tcPr>
+            <w:tcW w:type="dxa" w:w="1440"/>
+          </w:tcPr>
+          <w:p>
+            <w:r>
+              <w:t>#29</w:t>
+            </w:r>
+          </w:p>
+        </w:tc>
+        <w:tc>
+          <w:tcPr>
+            <w:tcW w:type="dxa" w:w="1440"/>
+          </w:tcPr>
+          <w:p>
+            <w:r>
+              <w:t>Atul Kumar</w:t>
+            </w:r>
+          </w:p>
+        </w:tc>
+        <w:tc>
+          <w:tcPr>
+            <w:tcW w:type="dxa" w:w="1440"/>
+          </w:tcPr>
+          <w:p>
+            <w:r>
+              <w:t>atulofficial02@gmail.com</w:t>
+            </w:r>
+          </w:p>
+        </w:tc>
+        <w:tc>
+          <w:tcPr>
+            <w:tcW w:type="dxa" w:w="1440"/>
+          </w:tcPr>
+          <w:p>
+            <w:r>
+              <w:t>+91-9368449979</w:t>
+            </w:r>
+          </w:p>
+        </w:tc>
+        <w:tc>
+          <w:tcPr>
+            <w:tcW w:type="dxa" w:w="1440"/>
+          </w:tcPr>
+          <w:p>
+            <w:r>
+              <w:t>42.0</w:t>
+            </w:r>
+          </w:p>
+        </w:tc>
+        <w:tc>
+          <w:tcPr>
+            <w:tcW w:type="dxa" w:w="1440"/>
+          </w:tcPr>
+          <w:p>
+            <w:r>
+              <w:t>Active Builder</w:t>
+            </w:r>
+          </w:p>
+        </w:tc>
+      </w:tr>
+      <w:tr>
+        <w:tc>
+          <w:tcPr>
+            <w:tcW w:type="dxa" w:w="1440"/>
+          </w:tcPr>
+          <w:p>
+            <w:r>
+              <w:t>#30</w:t>
+            </w:r>
+          </w:p>
+        </w:tc>
+        <w:tc>
+          <w:tcPr>
+            <w:tcW w:type="dxa" w:w="1440"/>
+          </w:tcPr>
+          <w:p>
+            <w:r>
               <w:t>Higher Secondary Science Pcmb</w:t>
             </w:r>
           </w:p>
@@ -1854,7 +1974,7 @@
           </w:tcPr>
           <w:p>
             <w:r>
-              <w:t>44.5</w:t>
+              <w:t>41.0</w:t>
             </w:r>
           </w:p>
         </w:tc>
@@ -1864,7 +1984,7 @@
           </w:tcPr>
           <w:p>
             <w:r>
-              <w:t>Emerging Developer</w:t>
+              <w:t>Unverified (Rate Limited)</w:t>
             </w:r>
           </w:p>
         </w:tc>
@@ -1876,69 +1996,7 @@
           </w:tcPr>
           <w:p>
             <w:r>
-              <w:t>#29</w:t>
-            </w:r>
-          </w:p>
-        </w:tc>
-        <w:tc>
-          <w:tcPr>
-            <w:tcW w:type="dxa" w:w="1440"/>
-          </w:tcPr>
-          <w:p>
-            <w:r>
-              <w:t>Annisha S</w:t>
-            </w:r>
-          </w:p>
-        </w:tc>
-        <w:tc>
-          <w:tcPr>
-            <w:tcW w:type="dxa" w:w="1440"/>
-          </w:tcPr>
-          <w:p>
-            <w:r>
-              <w:t>annishasaravanan83@gmail.com</w:t>
-            </w:r>
-          </w:p>
-        </w:tc>
-        <w:tc>
-          <w:tcPr>
-            <w:tcW w:type="dxa" w:w="1440"/>
-          </w:tcPr>
-          <w:p>
-            <w:r>
-              <w:t>9361112081</w:t>
-            </w:r>
-          </w:p>
-        </w:tc>
-        <w:tc>
-          <w:tcPr>
-            <w:tcW w:type="dxa" w:w="1440"/>
-          </w:tcPr>
-          <w:p>
-            <w:r>
-              <w:t>44.0</w:t>
-            </w:r>
-          </w:p>
-        </w:tc>
-        <w:tc>
-          <w:tcPr>
-            <w:tcW w:type="dxa" w:w="1440"/>
-          </w:tcPr>
-          <w:p>
-            <w:r>
-              <w:t>Active Developer</w:t>
-            </w:r>
-          </w:p>
-        </w:tc>
-      </w:tr>
-      <w:tr>
-        <w:tc>
-          <w:tcPr>
-            <w:tcW w:type="dxa" w:w="1440"/>
-          </w:tcPr>
-          <w:p>
-            <w:r>
-              <w:t>#30</w:t>
+              <w:t>#31</w:t>
             </w:r>
           </w:p>
         </w:tc>
@@ -1978,7 +2036,7 @@
           </w:tcPr>
           <w:p>
             <w:r>
-              <w:t>40.0</w:t>
+              <w:t>35.0</w:t>
             </w:r>
           </w:p>
         </w:tc>
@@ -1988,69 +2046,7 @@
           </w:tcPr>
           <w:p>
             <w:r>
-              <w:t>Active Developer</w:t>
-            </w:r>
-          </w:p>
-        </w:tc>
-      </w:tr>
-      <w:tr>
-        <w:tc>
-          <w:tcPr>
-            <w:tcW w:type="dxa" w:w="1440"/>
-          </w:tcPr>
-          <w:p>
-            <w:r>
-              <w:t>#31</w:t>
-            </w:r>
-          </w:p>
-        </w:tc>
-        <w:tc>
-          <w:tcPr>
-            <w:tcW w:type="dxa" w:w="1440"/>
-          </w:tcPr>
-          <w:p>
-            <w:r>
-              <w:t>Atul Kumar</w:t>
-            </w:r>
-          </w:p>
-        </w:tc>
-        <w:tc>
-          <w:tcPr>
-            <w:tcW w:type="dxa" w:w="1440"/>
-          </w:tcPr>
-          <w:p>
-            <w:r>
-              <w:t>atulofficial02@gmail.com</w:t>
-            </w:r>
-          </w:p>
-        </w:tc>
-        <w:tc>
-          <w:tcPr>
-            <w:tcW w:type="dxa" w:w="1440"/>
-          </w:tcPr>
-          <w:p>
-            <w:r>
-              <w:t>+91-9368449979</w:t>
-            </w:r>
-          </w:p>
-        </w:tc>
-        <w:tc>
-          <w:tcPr>
-            <w:tcW w:type="dxa" w:w="1440"/>
-          </w:tcPr>
-          <w:p>
-            <w:r>
-              <w:t>39.0</w:t>
-            </w:r>
-          </w:p>
-        </w:tc>
-        <w:tc>
-          <w:tcPr>
-            <w:tcW w:type="dxa" w:w="1440"/>
-          </w:tcPr>
-          <w:p>
-            <w:r>
-              <w:t>Active Developer</w:t>
+              <w:t>Unverified (Rate Limited)</w:t>
             </w:r>
           </w:p>
         </w:tc>
@@ -2102,7 +2098,7 @@
           </w:tcPr>
           <w:p>
             <w:r>
-              <w:t>30.5</w:t>
+              <w:t>28.0</w:t>
             </w:r>
           </w:p>
         </w:tc>
@@ -2112,7 +2108,7 @@
           </w:tcPr>
           <w:p>
             <w:r>
-              <w:t>Active Developer</w:t>
+              <w:t>Unverified (Rate Limited)</w:t>
             </w:r>
           </w:p>
         </w:tc>
@@ -2147,11 +2143,11 @@
         <w:br/>
       </w:r>
       <w:r>
-        <w:t>GitHub: Veteran Builder (4.2 yrs, 35 repos, 0 contributions, 0 PRs)</w:t>
+        <w:t>GitHub: Veteran Builder (4.2 yrs, 35 repos, 45 contributions, 0 PRs)</w:t>
         <w:br/>
       </w:r>
       <w:r>
-        <w:t>Evaluation Notes: V Sree Raghu Vardhan qualifies as an eligible candidate with a total score of 94.5/100. The candidate demonstrates practical engineering capability highlighted by stateful multi-agent orchestration (langgraph/crewai/autogen), vector database retrieval (chromadb/faiss/pinecone/qdrant), supported by core stack competencies in Python, FastAPI, Django, PostgreSQL, Redis. GitHub enrichment indicates: Veteran Builder (4.2 yrs on GitHub, 35 repos, 0 recent commits). 3 relevant Python/AI repositories identified. Primary area for review: No significant technical weaknesses observed. Overall, this profile exhibits solid engineering depth and the requisite hands-on exposure to modern agentic systems to succeed in the SDE AI internship.</w:t>
+        <w:t>Evaluation Notes: At 94.5/100, V Sree Raghu Vardhan stands out through cloud infrastructure (aws/azure), complemented by full stack capability (react/next.js/typescript). Plus strong public github footprint (veteran builder) rounds out the build. Core evidence in Python, FastAPI, Django, PostgreSQL, Redis maps to AI 37.0 and Python 30.0 bands. GitHub profile: Veteran Builder (4.2 yrs on GitHub, 35 repos [24 original], 45 contributions in past year [0 commits]). 3 relevant Python/AI repositories identified. Growth edge to probe in interview: polishing production hardening.</w:t>
         <w:br/>
       </w:r>
     </w:p>
@@ -2160,7 +2156,7 @@
         <w:pStyle w:val="Heading2"/>
       </w:pPr>
       <w:r>
-        <w:t>#2 - Prathamesh Patil (88.5/100)</w:t>
+        <w:t>#2 - Prathamesh Patil (91.0/100)</w:t>
       </w:r>
     </w:p>
     <w:p>
@@ -2168,19 +2164,19 @@
         <w:rPr>
           <w:b/>
         </w:rPr>
-        <w:t>Contact: prathameshpatil330@gmail.com | N/A | Resume: candidate_35.pdf</w:t>
+        <w:t>Contact: prathameshpatil330@gmail.com | +91 73490 41840 | Resume: candidate_35.pdf</w:t>
         <w:br/>
       </w:r>
       <w:r>
-        <w:t>Score Breakdown: AI Depth: 32.0 | Python: 30.0 | Cloud: 14.0 | GitHub: 7.5 | Eng: 5.0</w:t>
+        <w:t>Score Breakdown: AI Depth: 32.0 | Python: 30.0 | Cloud: 14.0 | GitHub: 10.0 | Eng: 5.0</w:t>
         <w:br/>
       </w:r>
       <w:r>
-        <w:t>GitHub: Veteran Builder (3.9 yrs, 18 repos, 0 contributions, 0 PRs)</w:t>
+        <w:t>GitHub: Veteran Builder (3.9 yrs, 18 repos, 121 contributions, 28 PRs)</w:t>
         <w:br/>
       </w:r>
       <w:r>
-        <w:t>Evaluation Notes: Prathamesh Patil qualifies as an eligible candidate with a total score of 88.5/100. The candidate demonstrates practical engineering capability highlighted by stateful multi-agent orchestration (langgraph/crewai/autogen), vector database retrieval (chromadb/faiss/pinecone/qdrant), supported by core stack competencies in Python, FastAPI, PostgreSQL, Redis, Docker. GitHub enrichment indicates: Veteran Builder (3.9 yrs on GitHub, 18 repos, 0 recent commits). 0 relevant Python/AI repositories identified. Primary area for review: No significant technical weaknesses observed. Overall, this profile exhibits solid engineering depth and the requisite hands-on exposure to modern agentic systems to succeed in the SDE AI internship.</w:t>
+        <w:t>Evaluation Notes: Prathamesh Patil scored 91.0/100 (AI 32.0/40, Python 30.0/30, Cloud 14.0/15, GitHub 10.0/10), led by strong public github footprint (veteran builder) and automated testing / ci/cd pipeline Backed by distributed task queues (celery/rabbitmq/kafka). Stack centers on Python, FastAPI, PostgreSQL, Redis. GitHub: Veteran Builder (3.9 yrs on GitHub, 18 repos [17 original], 121 contributions in past year [0 commits, 28 PRs], 3 stars). 14 relevant Python/AI repositories identified. Watch-item: polishing production hardening. Fit for SDE AI internship is strong on shipped agentic depth.</w:t>
         <w:br/>
       </w:r>
     </w:p>
@@ -2189,65 +2185,7 @@
         <w:pStyle w:val="Heading2"/>
       </w:pPr>
       <w:r>
-        <w:t>#3 - Sumaiya Sultana Shaik (82.5/100)</w:t>
-      </w:r>
-    </w:p>
-    <w:p>
-      <w:r>
-        <w:rPr>
-          <w:b/>
-        </w:rPr>
-        <w:t>Contact: sultanasumaiya623@gmail.com | N/A | Resume: candidate_28.pdf</w:t>
-        <w:br/>
-      </w:r>
-      <w:r>
-        <w:t>Score Breakdown: AI Depth: 31.0 | Python: 23.0 | Cloud: 15.0 | GitHub: 10.0 | Eng: 3.5</w:t>
-        <w:br/>
-      </w:r>
-      <w:r>
-        <w:t>GitHub: Active Builder (2.7 yrs, 29 repos, 0 contributions, 0 PRs)</w:t>
-        <w:br/>
-      </w:r>
-      <w:r>
-        <w:t>Evaluation Notes: Sumaiya Sultana Shaik qualifies as an eligible candidate with a total score of 82.5/100. The candidate demonstrates practical engineering capability highlighted by stateful multi-agent orchestration (langgraph/crewai/autogen), embeddings-based retrieval system, supported by core stack competencies in Python, FastAPI, PostgreSQL, Docker, GCP. GitHub enrichment indicates: Active Builder (2.7 yrs on GitHub, 29 repos, 0 recent commits). 14 relevant Python/AI repositories identified. Primary area for review: Limited Redis or backend caching evidence. Overall, this profile exhibits solid engineering depth and the requisite hands-on exposure to modern agentic systems to succeed in the SDE AI internship.</w:t>
-        <w:br/>
-      </w:r>
-    </w:p>
-    <w:p>
-      <w:pPr>
-        <w:pStyle w:val="Heading2"/>
-      </w:pPr>
-      <w:r>
-        <w:t>#4 - Arjun Kumar (81.5/100)</w:t>
-      </w:r>
-    </w:p>
-    <w:p>
-      <w:r>
-        <w:rPr>
-          <w:b/>
-        </w:rPr>
-        <w:t>Contact: roy.prajapat.143@gmail.com | +91-6396303191 | Resume: candidate_08.pdf</w:t>
-        <w:br/>
-      </w:r>
-      <w:r>
-        <w:t>Score Breakdown: AI Depth: 35.0 | Python: 25.0 | Cloud: 8.0 | GitHub: 10.0 | Eng: 3.5</w:t>
-        <w:br/>
-      </w:r>
-      <w:r>
-        <w:t>GitHub: Veteran Builder (3.0 yrs, 26 repos, 0 contributions, 0 PRs)</w:t>
-        <w:br/>
-      </w:r>
-      <w:r>
-        <w:t>Evaluation Notes: Arjun Kumar qualifies as an eligible candidate with a total score of 81.5/100. The candidate demonstrates practical engineering capability highlighted by stateful multi-agent orchestration (langgraph/crewai/autogen), embeddings-based retrieval system, supported by core stack competencies in Python, FastAPI, Django, PostgreSQL, AWS. GitHub enrichment indicates: Veteran Builder (3.0 yrs on GitHub, 26 repos, 0 recent commits). 13 relevant Python/AI repositories identified. Primary area for review: Limited Redis or backend caching evidence. Overall, this profile exhibits solid engineering depth and the requisite hands-on exposure to modern agentic systems to succeed in the SDE AI internship.</w:t>
-        <w:br/>
-      </w:r>
-    </w:p>
-    <w:p>
-      <w:pPr>
-        <w:pStyle w:val="Heading2"/>
-      </w:pPr>
-      <w:r>
-        <w:t>#5 - Gourab Das (81.5/100)</w:t>
+        <w:t>#3 - Gourab Das (81.5/100)</w:t>
       </w:r>
     </w:p>
     <w:p>
@@ -2263,11 +2201,11 @@
         <w:br/>
       </w:r>
       <w:r>
-        <w:t>GitHub: Veteran Builder (6.3 yrs, 21 repos, 0 contributions, 0 PRs)</w:t>
+        <w:t>GitHub: Veteran Builder (6.3 yrs, 21 repos, 3 contributions, 0 PRs)</w:t>
         <w:br/>
       </w:r>
       <w:r>
-        <w:t>Evaluation Notes: Gourab Das qualifies as an eligible candidate with a total score of 81.5/100. The candidate demonstrates practical engineering capability highlighted by stateful multi-agent orchestration (langgraph/crewai/autogen), advanced rag with hybrid search and reranking, supported by core stack competencies in Python, FastAPI, Django, Flask, PostgreSQL. GitHub enrichment indicates: Veteran Builder (6.3 yrs on GitHub, 21 repos, 0 recent commits). 4 relevant Python/AI repositories identified. Primary area for review: No significant technical weaknesses observed. Overall, this profile exhibits solid engineering depth and the requisite hands-on exposure to modern agentic systems to succeed in the SDE AI internship.</w:t>
+        <w:t>Evaluation Notes: Gourab Das (81.5/100) impressed with advanced rag with hybrid search and reranking alongside async fastapi backend architecture. Also notable: postgresql with orm / schema migrations. Depth spans Python, FastAPI, Django, Flask, PostgreSQL, Redis (cloud 14.0/15, GitHub 10.0/10). Activity: Veteran Builder (6.3 yrs on GitHub, 21 repos [12 original], 3 contributions in past year [0 commits]). 4 relevant Python/AI repositories identified. Interview focus should be polishing production hardening, but overall internship readiness is high.</w:t>
         <w:br/>
       </w:r>
     </w:p>
@@ -2276,36 +2214,7 @@
         <w:pStyle w:val="Heading2"/>
       </w:pPr>
       <w:r>
-        <w:t>#6 - Yash Maini (78.0/100)</w:t>
-      </w:r>
-    </w:p>
-    <w:p>
-      <w:r>
-        <w:rPr>
-          <w:b/>
-        </w:rPr>
-        <w:t>Contact: mainiyash2@gmail.com | +91-8920028757 | Resume: candidate_13.pdf</w:t>
-        <w:br/>
-      </w:r>
-      <w:r>
-        <w:t>Score Breakdown: AI Depth: 33.0 | Python: 22.0 | Cloud: 11.0 | GitHub: 10.0 | Eng: 2.0</w:t>
-        <w:br/>
-      </w:r>
-      <w:r>
-        <w:t>GitHub: Veteran Builder (3.8 yrs, 47 repos, 0 contributions, 0 PRs)</w:t>
-        <w:br/>
-      </w:r>
-      <w:r>
-        <w:t>Evaluation Notes: Yash Maini qualifies as an eligible candidate with a total score of 78.0/100. The candidate demonstrates practical engineering capability highlighted by stateful multi-agent orchestration (langgraph/crewai/autogen), vector database retrieval (chromadb/faiss/pinecone/qdrant), supported by core stack competencies in Python, FastAPI, Flask, PostgreSQL, Postgres. GitHub enrichment indicates: Veteran Builder (3.8 yrs on GitHub, 47 repos, 0 recent commits). 22 relevant Python/AI repositories identified. Primary area for review: Limited Redis or backend caching evidence. Overall, this profile exhibits solid engineering depth and the requisite hands-on exposure to modern agentic systems to succeed in the SDE AI internship.</w:t>
-        <w:br/>
-      </w:r>
-    </w:p>
-    <w:p>
-      <w:pPr>
-        <w:pStyle w:val="Heading2"/>
-      </w:pPr>
-      <w:r>
-        <w:t>#7 - Vaibhav Wakde (75.5/100)</w:t>
+        <w:t>#4 - Vaibhav Wakde (75.5/100)</w:t>
       </w:r>
     </w:p>
     <w:p>
@@ -2321,11 +2230,11 @@
         <w:br/>
       </w:r>
       <w:r>
-        <w:t>GitHub: Veteran Builder (3.5 yrs, 10 repos, 0 contributions, 0 PRs)</w:t>
+        <w:t>GitHub: Veteran Builder (3.5 yrs, 10 repos, 12 contributions, 0 PRs)</w:t>
         <w:br/>
       </w:r>
       <w:r>
-        <w:t>Evaluation Notes: Vaibhav Wakde qualifies as an eligible candidate with a total score of 75.5/100. The candidate demonstrates practical engineering capability highlighted by stateful multi-agent orchestration (langgraph/crewai/autogen), vector database retrieval (chromadb/faiss/pinecone/qdrant), supported by core stack competencies in Python, FastAPI, Flask, Docker, AWS. GitHub enrichment indicates: Veteran Builder (3.5 yrs on GitHub, 10 repos, 0 recent commits). 4 relevant Python/AI repositories identified. Primary area for review: No significant technical weaknesses observed. Overall, this profile exhibits solid engineering depth and the requisite hands-on exposure to modern agentic systems to succeed in the SDE AI internship.</w:t>
+        <w:t>Evaluation Notes: Vaibhav Wakde (75.5/100) impressed with cloud infrastructure (aws/azure) alongside strong public github footprint (veteran builder). Also notable: automated testing / ci/cd pipeline. Depth spans Python, FastAPI, Flask, Docker, AWS, LangChain (cloud 10.0/15, GitHub 10.0/10). Activity: Veteran Builder (3.5 yrs on GitHub, 10 repos [10 original], 12 contributions in past year [0 commits]). 4 relevant Python/AI repositories identified. Interview focus should be polishing production hardening, but overall internship readiness is high.</w:t>
         <w:br/>
       </w:r>
     </w:p>
@@ -2334,7 +2243,7 @@
         <w:pStyle w:val="Heading2"/>
       </w:pPr>
       <w:r>
-        <w:t>#8 - Arunima Saha (75.5/100)</w:t>
+        <w:t>#5 - Arunima Saha (75.5/100)</w:t>
       </w:r>
     </w:p>
     <w:p>
@@ -2354,7 +2263,7 @@
         <w:br/>
       </w:r>
       <w:r>
-        <w:t>Evaluation Notes: Arunima Saha qualifies as an eligible candidate with a total score of 75.5/100. The candidate demonstrates practical engineering capability highlighted by stateful multi-agent orchestration (langgraph/crewai/autogen), advanced rag with hybrid search and reranking, supported by core stack competencies in Python, FastAPI, PostgreSQL, Docker, Google Cloud. GitHub enrichment indicates: No public GitHub profile provided. Primary area for review: Limited Redis or backend caching evidence. Overall, this profile exhibits solid engineering depth and the requisite hands-on exposure to modern agentic systems to succeed in the SDE AI internship.</w:t>
+        <w:t>Evaluation Notes: Arunima Saha (75.5/100) impressed with advanced rag with hybrid search and reranking alongside ai evaluation pipeline (ragas/langsmith/trulens). Also notable: modern python backend framework (fastapi/django). Depth spans Python, FastAPI, PostgreSQL, Docker, Google Cloud, AWS (cloud 11.0/15, GitHub 0.0/10). Activity: No public GitHub profile provided. Interview focus should be no explicit testing (pytest/unit tests) mentioned, but overall internship readiness is high.</w:t>
         <w:br/>
       </w:r>
     </w:p>
@@ -2363,7 +2272,7 @@
         <w:pStyle w:val="Heading2"/>
       </w:pPr>
       <w:r>
-        <w:t>#9 - Abhinav Mishra (73.5/100)</w:t>
+        <w:t>#6 - Abhinav Mishra (73.5/100)</w:t>
       </w:r>
     </w:p>
     <w:p>
@@ -2379,11 +2288,11 @@
         <w:br/>
       </w:r>
       <w:r>
-        <w:t>GitHub: Veteran Builder (3.4 yrs, 61 repos, 0 contributions, 0 PRs)</w:t>
+        <w:t>GitHub: Veteran Builder (3.4 yrs, 61 repos, 4315 contributions, 1 PRs)</w:t>
         <w:br/>
       </w:r>
       <w:r>
-        <w:t>Evaluation Notes: Abhinav Mishra qualifies as an eligible candidate with a total score of 73.5/100. The candidate demonstrates practical engineering capability highlighted by stateful multi-agent orchestration (langgraph/crewai/autogen), embeddings-based retrieval system, supported by core stack competencies in Python, FastAPI, PostgreSQL, Redis, Azure. GitHub enrichment indicates: Veteran Builder (3.4 yrs on GitHub, 61 repos, 0 recent commits). 9 relevant Python/AI repositories identified. Primary area for review: No significant technical weaknesses observed. Overall, this profile exhibits solid engineering depth and the requisite hands-on exposure to modern agentic systems to succeed in the SDE AI internship.</w:t>
+        <w:t>Evaluation Notes: Abhinav’s 3.4-year GitHub tenure reveals a veteran builder with 28 original repositories, proving sustained commitment beyond typical intern portfolios. His technical depth shines through stateful multi-agent orchestration using LangGraph and robust RAG pipelines, anchored by a modern FastAPI and PostgreSQL backend. The cloud_fullstack score indicates a minor gap in enterprise Azure deployment, though his Python and Redis proficiency mitigates this. This blend of architectural maturity and practical AI implementation makes him an immediate, low-risk asset for our engineering team.</w:t>
         <w:br/>
       </w:r>
     </w:p>
@@ -2392,7 +2301,7 @@
         <w:pStyle w:val="Heading2"/>
       </w:pPr>
       <w:r>
-        <w:t>#10 - Hari Shanker Sharma (73.5/100)</w:t>
+        <w:t>#7 - Hari Shanker Sharma (73.5/100)</w:t>
       </w:r>
     </w:p>
     <w:p>
@@ -2412,7 +2321,7 @@
         <w:br/>
       </w:r>
       <w:r>
-        <w:t>Evaluation Notes: Hari Shanker Sharma qualifies as an eligible candidate with a total score of 73.5/100. The candidate demonstrates practical engineering capability highlighted by stateful multi-agent orchestration (langgraph/crewai/autogen), vector database retrieval (chromadb/faiss/pinecone/qdrant), supported by core stack competencies in Python, FastAPI, PostgreSQL, Redis, Docker. GitHub enrichment indicates: GitHub API rate limit exceeded; skipped enrichment. Primary area for review: Low or dormant public GitHub activity. Overall, this profile exhibits solid engineering depth and the requisite hands-on exposure to modern agentic systems to succeed in the SDE AI internship.</w:t>
+        <w:t>Evaluation Notes: Hari Shanker Sharma scored 73.5/100 (AI 29.0/40, Python 27.0/30, Cloud 14.0/15, GitHub 0.0/10), led by distributed task queues (celery/rabbitmq/kafka) and stateful multi-agent orchestration (langgraph/crewai/autogen) Backed by vector database retrieval (chromadb/faiss/pinecone/qdrant). Stack centers on Python, FastAPI, PostgreSQL, Redis. GitHub: GitHub API rate limit exceeded; skipped enrichment. Watch-item: low or dormant public github activity. Fit for SDE AI internship is strong on shipped agentic depth.</w:t>
         <w:br/>
       </w:r>
     </w:p>
@@ -2421,7 +2330,7 @@
         <w:pStyle w:val="Heading2"/>
       </w:pPr>
       <w:r>
-        <w:t>#11 - Jyandeep Baishya (73.0/100)</w:t>
+        <w:t>#8 - Sumaiya Sultana Shaik (72.5/100)</w:t>
       </w:r>
     </w:p>
     <w:p>
@@ -2429,19 +2338,19 @@
         <w:rPr>
           <w:b/>
         </w:rPr>
-        <w:t>Contact: craftzyan@gmail.com | 6002590335 | Resume: candidate_07.pdf</w:t>
+        <w:t>Contact: sultanasumaiya623@gmail.com | +91 97015 28467 | Resume: candidate_28.pdf</w:t>
         <w:br/>
       </w:r>
       <w:r>
-        <w:t>Score Breakdown: AI Depth: 33.0 | Python: 22.0 | Cloud: 8.0 | GitHub: 10.0 | Eng: 0.0</w:t>
+        <w:t>Score Breakdown: AI Depth: 31.0 | Python: 23.0 | Cloud: 15.0 | GitHub: 0.0 | Eng: 3.5</w:t>
         <w:br/>
       </w:r>
       <w:r>
-        <w:t>GitHub: Veteran Builder (3.4 yrs, 45 repos, 0 contributions, 0 PRs)</w:t>
+        <w:t>GitHub: Unverified (Rate Limited) (0.0 yrs, 0 repos, 0 contributions, 0 PRs)</w:t>
         <w:br/>
       </w:r>
       <w:r>
-        <w:t>Evaluation Notes: Jyandeep Baishya qualifies as an eligible candidate with a total score of 73.0/100. The candidate demonstrates practical engineering capability highlighted by stateful multi-agent orchestration (langgraph/crewai/autogen), vector database retrieval (chromadb/faiss/pinecone/qdrant), supported by core stack competencies in Python, FastAPI, Redis, LangChain, LangGraph. GitHub enrichment indicates: Veteran Builder (3.4 yrs on GitHub, 45 repos, 0 recent commits). 7 relevant Python/AI repositories identified. Primary area for review: No explicit testing (pytest/unit tests) mentioned. Overall, this profile exhibits solid engineering depth and the requisite hands-on exposure to modern agentic systems to succeed in the SDE AI internship.</w:t>
+        <w:t>Evaluation Notes: Sumaiya Sultana Shaik demonstrates promising architectural instincts through stateful multi-agent orchestration using LangGraph and CrewAI, paired with a solid FastAPI and PostgreSQL backend. Her experience integrating RAG pipelines with Docker and GCP shows practical fullstack capability. However, her public GitHub activity is currently dormant or inaccessible due to API limits, obscuring her broader engineering depth. The primary gap is a lack of evidence for Redis caching or performance optimization. Despite these unknowns, her core AI backend skills align well with our intern needs, warranting a technical interview to validate her hands-on proficiency.</w:t>
         <w:br/>
       </w:r>
     </w:p>
@@ -2450,7 +2359,36 @@
         <w:pStyle w:val="Heading2"/>
       </w:pPr>
       <w:r>
-        <w:t>#12 - Kiran Naregal (70.5/100)</w:t>
+        <w:t>#9 - Arjun Kumar (71.5/100)</w:t>
+      </w:r>
+    </w:p>
+    <w:p>
+      <w:r>
+        <w:rPr>
+          <w:b/>
+        </w:rPr>
+        <w:t>Contact: roy.prajapat.143@gmail.com | +91-6396303191 | Resume: candidate_08.pdf</w:t>
+        <w:br/>
+      </w:r>
+      <w:r>
+        <w:t>Score Breakdown: AI Depth: 35.0 | Python: 25.0 | Cloud: 8.0 | GitHub: 0.0 | Eng: 3.5</w:t>
+        <w:br/>
+      </w:r>
+      <w:r>
+        <w:t>GitHub: Unverified (Rate Limited) (0.0 yrs, 0 repos, 0 contributions, 0 PRs)</w:t>
+        <w:br/>
+      </w:r>
+      <w:r>
+        <w:t>Evaluation Notes: At 71.5/100, Arjun Kumar stands out through automated testing / ci/cd pipeline, complemented by observability and concurrency handling. Plus stateful multi-agent orchestration (langgraph/crewai/autogen) rounds out the build. Core evidence in Python, FastAPI, Django, PostgreSQL, AWS maps to AI 35.0 and Python 25.0 bands. GitHub profile: GitHub API rate limit exceeded; skipped enrichment. Growth edge to probe in interview: limited redis or backend caching evidence.</w:t>
+        <w:br/>
+      </w:r>
+    </w:p>
+    <w:p>
+      <w:pPr>
+        <w:pStyle w:val="Heading2"/>
+      </w:pPr>
+      <w:r>
+        <w:t>#10 - Kiran Naregal (70.5/100)</w:t>
       </w:r>
     </w:p>
     <w:p>
@@ -2470,7 +2408,7 @@
         <w:br/>
       </w:r>
       <w:r>
-        <w:t>Evaluation Notes: Kiran Naregal qualifies as an eligible candidate with a total score of 70.5/100. The candidate demonstrates practical engineering capability highlighted by stateful multi-agent orchestration (langgraph/crewai/autogen), embeddings-based retrieval system, supported by core stack competencies in Python, FastAPI, Docker, AWS, LangChain. GitHub enrichment indicates: GitHub API rate limit exceeded; skipped enrichment. Primary area for review: Limited Redis or backend caching evidence. Overall, this profile exhibits solid engineering depth and the requisite hands-on exposure to modern agentic systems to succeed in the SDE AI internship.</w:t>
+        <w:t>Evaluation Notes: Kiran Naregal scored 70.5/100 (AI 35.0/40, Python 20.0/30, Cloud 14.0/15, GitHub 0.0/10), led by observability and concurrency handling and stateful multi-agent orchestration (langgraph/crewai/autogen) Backed by embeddings-based retrieval system. Stack centers on Python, FastAPI, Docker, AWS. GitHub: GitHub API rate limit exceeded; skipped enrichment. Watch-item: limited redis or backend caching evidence. Fit for SDE AI internship is strong on shipped agentic depth.</w:t>
         <w:br/>
       </w:r>
     </w:p>
@@ -2479,36 +2417,7 @@
         <w:pStyle w:val="Heading2"/>
       </w:pPr>
       <w:r>
-        <w:t>#13 - Krishan Kant (69.5/100)</w:t>
-      </w:r>
-    </w:p>
-    <w:p>
-      <w:r>
-        <w:rPr>
-          <w:b/>
-        </w:rPr>
-        <w:t>Contact: krishankantptu@gmail.com | +91-6204142591 | Resume: candidate_09.pdf</w:t>
-        <w:br/>
-      </w:r>
-      <w:r>
-        <w:t>Score Breakdown: AI Depth: 23.0 | Python: 25.0 | Cloud: 10.0 | GitHub: 8.5 | Eng: 3.0</w:t>
-        <w:br/>
-      </w:r>
-      <w:r>
-        <w:t>GitHub: Veteran Builder (4.0 yrs, 21 repos, 0 contributions, 0 PRs)</w:t>
-        <w:br/>
-      </w:r>
-      <w:r>
-        <w:t>Evaluation Notes: Krishan Kant qualifies as an eligible candidate with a total score of 69.5/100. The candidate demonstrates practical engineering capability highlighted by agentic workflow with tool/function calling, embeddings-based retrieval system, supported by core stack competencies in Python, PostgreSQL, Redis, Docker, LangChain. GitHub enrichment indicates: Veteran Builder (4.0 yrs on GitHub, 21 repos, 0 recent commits). 2 relevant Python/AI repositories identified. Primary area for review: No explicit testing (pytest/unit tests) mentioned. Overall, this profile exhibits solid engineering depth and the requisite hands-on exposure to modern agentic systems to succeed in the SDE AI internship.</w:t>
-        <w:br/>
-      </w:r>
-    </w:p>
-    <w:p>
-      <w:pPr>
-        <w:pStyle w:val="Heading2"/>
-      </w:pPr>
-      <w:r>
-        <w:t>#14 - Vivek Chimnani (68.5/100)</w:t>
+        <w:t>#11 - Vivek Chimnani (68.5/100)</w:t>
       </w:r>
     </w:p>
     <w:p>
@@ -2528,7 +2437,7 @@
         <w:br/>
       </w:r>
       <w:r>
-        <w:t>Evaluation Notes: Vivek Chimnani qualifies as an eligible candidate with a total score of 68.5/100. The candidate demonstrates practical engineering capability highlighted by stateful multi-agent orchestration (langgraph/crewai/autogen), async fastapi backend architecture, supported by core stack competencies in Python, FastAPI, PostgreSQL, Redis, Docker. GitHub enrichment indicates: GitHub API rate limit exceeded; skipped enrichment. Primary area for review: Low or dormant public GitHub activity. Overall, this profile exhibits solid engineering depth and the requisite hands-on exposure to modern agentic systems to succeed in the SDE AI internship.</w:t>
+        <w:t>Evaluation Notes: At 68.5/100, Vivek Chimnani stands out through automated testing / ci/cd pipeline, complemented by observability and concurrency handling. Plus stateful multi-agent orchestration (langgraph/crewai/autogen) rounds out the build. Core evidence in Python, FastAPI, PostgreSQL, Redis, Docker maps to AI 24.0 and Python 27.0 bands. GitHub profile: GitHub API rate limit exceeded; skipped enrichment. Growth edge to probe in interview: low or dormant public github activity.</w:t>
         <w:br/>
       </w:r>
     </w:p>
@@ -2537,7 +2446,36 @@
         <w:pStyle w:val="Heading2"/>
       </w:pPr>
       <w:r>
-        <w:t>#15 - Prajwal A S (65.0/100)</w:t>
+        <w:t>#12 - Yash Maini (68.0/100)</w:t>
+      </w:r>
+    </w:p>
+    <w:p>
+      <w:r>
+        <w:rPr>
+          <w:b/>
+        </w:rPr>
+        <w:t>Contact: mainiyash2@gmail.com | +91-8920028757 | Resume: candidate_13.pdf</w:t>
+        <w:br/>
+      </w:r>
+      <w:r>
+        <w:t>Score Breakdown: AI Depth: 33.0 | Python: 22.0 | Cloud: 11.0 | GitHub: 0.0 | Eng: 2.0</w:t>
+        <w:br/>
+      </w:r>
+      <w:r>
+        <w:t>GitHub: Unverified (Rate Limited) (0.0 yrs, 0 repos, 0 contributions, 0 PRs)</w:t>
+        <w:br/>
+      </w:r>
+      <w:r>
+        <w:t>Evaluation Notes: Yash Maini scored 68.0/100 (AI 33.0/40, Python 22.0/30, Cloud 11.0/15, GitHub 0.0/10), led by automated testing / ci/cd pipeline and stateful multi-agent orchestration (langgraph/crewai/autogen) Backed by vector database retrieval (chromadb/faiss/pinecone/qdrant). Stack centers on Python, FastAPI, Flask, PostgreSQL. GitHub: GitHub API rate limit exceeded; skipped enrichment. Watch-item: limited redis or backend caching evidence. Fit for SDE AI internship is strong on shipped agentic depth.</w:t>
+        <w:br/>
+      </w:r>
+    </w:p>
+    <w:p>
+      <w:pPr>
+        <w:pStyle w:val="Heading2"/>
+      </w:pPr>
+      <w:r>
+        <w:t>#13 - Prajwal A S (68.0/100)</w:t>
       </w:r>
     </w:p>
     <w:p>
@@ -2549,15 +2487,218 @@
         <w:br/>
       </w:r>
       <w:r>
-        <w:t>Score Breakdown: AI Depth: 31.0 | Python: 25.0 | Cloud: 4.0 | GitHub: 5.0 | Eng: 0.0</w:t>
+        <w:t>Score Breakdown: AI Depth: 31.0 | Python: 25.0 | Cloud: 4.0 | GitHub: 8.0 | Eng: 0.0</w:t>
         <w:br/>
       </w:r>
       <w:r>
-        <w:t>GitHub: Active Developer (2.9 yrs, 32 repos, 0 contributions, 0 PRs)</w:t>
+        <w:t>GitHub: Active Builder (2.9 yrs, 32 repos, 44 contributions, 0 PRs)</w:t>
         <w:br/>
       </w:r>
       <w:r>
-        <w:t>Evaluation Notes: Prajwal A S qualifies as an eligible candidate with a total score of 65.0/100. The candidate demonstrates practical engineering capability highlighted by stateful multi-agent orchestration (langgraph/crewai/autogen), embeddings-based retrieval system, supported by core stack competencies in Python, FastAPI, Flask, PostgreSQL, LangChain. GitHub enrichment indicates: Active Developer (2.9 yrs on GitHub, 32 repos, 0 recent commits). 13 relevant Python/AI repositories identified. Primary area for review: Limited Redis or backend caching evidence. Overall, this profile exhibits solid engineering depth and the requisite hands-on exposure to modern agentic systems to succeed in the SDE AI internship.</w:t>
+        <w:t>Evaluation Notes: At 68.0/100, Prajwal A S stands out through embeddings-based retrieval system, complemented by async fastapi backend architecture. Plus postgresql with orm / schema migrations rounds out the build. Core evidence in Python, FastAPI, Flask, PostgreSQL, LangChain maps to AI 31.0 and Python 25.0 bands. GitHub profile: Active Builder (2.9 yrs on GitHub, 32 repos [29 original], 44 contributions in past year [0 commits]). 13 relevant Python/AI repositories identified. Growth edge to probe in interview: no explicit testing (pytest/unit tests) mentioned.</w:t>
+        <w:br/>
+      </w:r>
+    </w:p>
+    <w:p>
+      <w:pPr>
+        <w:pStyle w:val="Heading2"/>
+      </w:pPr>
+      <w:r>
+        <w:t>#14 - Jyandeep Baishya (63.0/100)</w:t>
+      </w:r>
+    </w:p>
+    <w:p>
+      <w:r>
+        <w:rPr>
+          <w:b/>
+        </w:rPr>
+        <w:t>Contact: craftzyan@gmail.com | 6002590335 | Resume: candidate_07.pdf</w:t>
+        <w:br/>
+      </w:r>
+      <w:r>
+        <w:t>Score Breakdown: AI Depth: 33.0 | Python: 22.0 | Cloud: 8.0 | GitHub: 0.0 | Eng: 0.0</w:t>
+        <w:br/>
+      </w:r>
+      <w:r>
+        <w:t>GitHub: Unverified (Rate Limited) (0.0 yrs, 0 repos, 0 contributions, 0 PRs)</w:t>
+        <w:br/>
+      </w:r>
+      <w:r>
+        <w:t>Evaluation Notes: At 63.0/100, Jyandeep Baishya stands out through cloud infrastructure (aws/azure), complemented by full stack capability (react/next.js/typescript). Plus stateful multi-agent orchestration (langgraph/crewai/autogen) rounds out the build. Core evidence in Python, FastAPI, Redis, LangChain, LangGraph maps to AI 33.0 and Python 22.0 bands. GitHub profile: GitHub API rate limit exceeded; skipped enrichment. Growth edge to probe in interview: low or dormant public github activity.</w:t>
+        <w:br/>
+      </w:r>
+    </w:p>
+    <w:p>
+      <w:pPr>
+        <w:pStyle w:val="Heading2"/>
+      </w:pPr>
+      <w:r>
+        <w:t>#15 - M Sai Kushith (61.0/100)</w:t>
+      </w:r>
+    </w:p>
+    <w:p>
+      <w:r>
+        <w:rPr>
+          <w:b/>
+        </w:rPr>
+        <w:t>Contact: msaikushith718@gmail.com | +91-7842732706 | Resume: candidate_06.pdf</w:t>
+        <w:br/>
+      </w:r>
+      <w:r>
+        <w:t>Score Breakdown: AI Depth: 31.0 | Python: 20.0 | Cloud: 4.0 | GitHub: 6.0 | Eng: 0.0</w:t>
+        <w:br/>
+      </w:r>
+      <w:r>
+        <w:t>GitHub: Active Builder (1.3 yrs, 4 repos, 1 contributions, 0 PRs)</w:t>
+        <w:br/>
+      </w:r>
+      <w:r>
+        <w:t>Evaluation Notes: At 61.0/100, M Sai Kushith stands out through full stack capability (react/next.js/typescript), complemented by stateful multi-agent orchestration (langgraph/crewai/autogen). Plus embeddings-based retrieval system rounds out the build. Core evidence in Python, FastAPI, Django, PostgreSQL, LangChain maps to AI 31.0 and Python 20.0 bands. GitHub profile: Active Builder (1.3 yrs on GitHub, 4 repos [4 original], 1 contributions in past year [0 commits]). 1 relevant Python/AI repositories identified. Growth edge to probe in interview: no explicit testing (pytest/unit tests) mentioned.</w:t>
+        <w:br/>
+      </w:r>
+    </w:p>
+    <w:p>
+      <w:pPr>
+        <w:pStyle w:val="Heading2"/>
+      </w:pPr>
+      <w:r>
+        <w:t>#16 - Krishan Kant (61.0/100)</w:t>
+      </w:r>
+    </w:p>
+    <w:p>
+      <w:r>
+        <w:rPr>
+          <w:b/>
+        </w:rPr>
+        <w:t>Contact: krishankantptu@gmail.com | +91-6204142591 | Resume: candidate_09.pdf</w:t>
+        <w:br/>
+      </w:r>
+      <w:r>
+        <w:t>Score Breakdown: AI Depth: 23.0 | Python: 25.0 | Cloud: 10.0 | GitHub: 0.0 | Eng: 3.0</w:t>
+        <w:br/>
+      </w:r>
+      <w:r>
+        <w:t>GitHub: Unverified (Rate Limited) (0.0 yrs, 0 repos, 0 contributions, 0 PRs)</w:t>
+        <w:br/>
+      </w:r>
+      <w:r>
+        <w:t>Evaluation Notes: At 61.0/100, Krishan Kant stands out through distributed task queues (celery/rabbitmq/kafka), complemented by observability and concurrency handling. Plus agentic workflow with tool/function calling rounds out the build. Core evidence in Python, PostgreSQL, Redis, Docker, LangChain maps to AI 23.0 and Python 25.0 bands. GitHub profile: GitHub API rate limit exceeded; skipped enrichment. Growth edge to probe in interview: low or dormant public github activity.</w:t>
+        <w:br/>
+      </w:r>
+    </w:p>
+    <w:p>
+      <w:pPr>
+        <w:pStyle w:val="Heading2"/>
+      </w:pPr>
+      <w:r>
+        <w:t>#17 - Nevil Jasmin Mehta (60.5/100)</w:t>
+      </w:r>
+    </w:p>
+    <w:p>
+      <w:r>
+        <w:rPr>
+          <w:b/>
+        </w:rPr>
+        <w:t>Contact: nevilmehta5@gmail.com | +91-8347062282 | Resume: candidate_50.pdf</w:t>
+        <w:br/>
+      </w:r>
+      <w:r>
+        <w:t>Score Breakdown: AI Depth: 18.0 | Python: 27.0 | Cloud: 14.0 | GitHub: 0.0 | Eng: 1.5</w:t>
+        <w:br/>
+      </w:r>
+      <w:r>
+        <w:t>GitHub: Unverified (Rate Limited) (0.0 yrs, 0 repos, 0 contributions, 0 PRs)</w:t>
+        <w:br/>
+      </w:r>
+      <w:r>
+        <w:t>Evaluation Notes: Nevil Jasmin Mehta (60.5/100) impressed with vector database retrieval (chromadb/faiss/pinecone/qdrant) alongside async fastapi backend architecture. Also notable: postgresql with orm / schema migrations. Depth spans Python, FastAPI, Django, Flask, PostgreSQL, Redis (cloud 14.0/15, GitHub 0.0/10). Activity: GitHub API rate limit exceeded; skipped enrichment. Interview focus should be low or dormant public github activity, but overall internship readiness is high.</w:t>
+        <w:br/>
+      </w:r>
+    </w:p>
+    <w:p>
+      <w:pPr>
+        <w:pStyle w:val="Heading2"/>
+      </w:pPr>
+      <w:r>
+        <w:t>#18 - Thejeshwaar Paasila (59.5/100)</w:t>
+      </w:r>
+    </w:p>
+    <w:p>
+      <w:r>
+        <w:rPr>
+          <w:b/>
+        </w:rPr>
+        <w:t>Contact: thejeshwaarp@gmail.com | +91 6303204136 | Resume: candidate_26.pdf</w:t>
+        <w:br/>
+      </w:r>
+      <w:r>
+        <w:t>Score Breakdown: AI Depth: 16.0 | Python: 20.0 | Cloud: 15.0 | GitHub: 6.5 | Eng: 2.0</w:t>
+        <w:br/>
+      </w:r>
+      <w:r>
+        <w:t>GitHub: Emerging Developer (2.3 yrs, 3 repos, 10 contributions, 0 PRs)</w:t>
+        <w:br/>
+      </w:r>
+      <w:r>
+        <w:t>Evaluation Notes: At 59.5/100, Thejeshwaar Paasila stands out through modern python backend framework (fastapi/django), complemented by postgresql with orm / schema migrations. Plus docker containerization &amp; deployment rounds out the build. Core evidence in Python, Flask, PostgreSQL, Docker, Google Cloud maps to AI 16.0 and Python 20.0 bands. GitHub profile: Emerging Developer (2.3 yrs on GitHub, 3 repos [2 original], 10 contributions in past year [0 commits]). 1 relevant Python/AI repositories identified. Growth edge to probe in interview: limited redis or backend caching evidence.</w:t>
+        <w:br/>
+      </w:r>
+    </w:p>
+    <w:p>
+      <w:pPr>
+        <w:pStyle w:val="Heading2"/>
+      </w:pPr>
+      <w:r>
+        <w:t>#19 - Vivek Shekhawat (59.0/100)</w:t>
+      </w:r>
+    </w:p>
+    <w:p>
+      <w:r>
+        <w:rPr>
+          <w:b/>
+        </w:rPr>
+        <w:t>Contact: vivekshekhawatofficial1592002@gmail.com | +91-7734911626 | Resume: candidate_39.pdf</w:t>
+        <w:br/>
+      </w:r>
+      <w:r>
+        <w:t>Score Breakdown: AI Depth: 27.0 | Python: 23.0 | Cloud: 4.0 | GitHub: 3.5 | Eng: 1.5</w:t>
+        <w:br/>
+      </w:r>
+      <w:r>
+        <w:t>GitHub: Veteran Builder (4.1 yrs, 15 repos, 1 contributions, 0 PRs)</w:t>
+        <w:br/>
+      </w:r>
+      <w:r>
+        <w:t>Evaluation Notes: Vivek Shekhawat scored 59.0/100 (AI 27.0/40, Python 23.0/30, Cloud 4.0/15, GitHub 3.5/10), led by postgresql with orm / schema migrations and full stack capability (react/next.js/typescript) Backed by observability and concurrency handling. Stack centers on Python, Django, PostgreSQL, LangChain. GitHub: Veteran Builder (4.1 yrs on GitHub, 15 repos [0 original], 1 contributions in past year [0 commits]). 0 relevant Python/AI repositories identified. Watch-item: no explicit testing (pytest/unit tests) mentioned. Fit for SDE AI internship is strong on shipped agentic depth.</w:t>
+        <w:br/>
+      </w:r>
+    </w:p>
+    <w:p>
+      <w:pPr>
+        <w:pStyle w:val="Heading2"/>
+      </w:pPr>
+      <w:r>
+        <w:t>#20 - Pavani A (58.0/100)</w:t>
+      </w:r>
+    </w:p>
+    <w:p>
+      <w:r>
+        <w:rPr>
+          <w:b/>
+        </w:rPr>
+        <w:t>Contact: pavani10112004@gmail.com | +919742542200 | Resume: candidate_38.pdf</w:t>
+        <w:br/>
+      </w:r>
+      <w:r>
+        <w:t>Score Breakdown: AI Depth: 20.0 | Python: 20.0 | Cloud: 10.0 | GitHub: 6.0 | Eng: 2.0</w:t>
+        <w:br/>
+      </w:r>
+      <w:r>
+        <w:t>GitHub: Active Builder (1.9 yrs, 16 repos, 19 contributions, 0 PRs)</w:t>
+        <w:br/>
+      </w:r>
+      <w:r>
+        <w:t>Evaluation Notes: At 58.0/100, Pavani A stands out through postgresql with orm / schema migrations, complemented by docker containerization &amp; deployment. Plus full stack capability (react/next.js/typescript) rounds out the build. Core evidence in Python, FastAPI, Django, Flask, PostgreSQL maps to AI 20.0 and Python 20.0 bands. GitHub profile: Active Builder (1.9 yrs on GitHub, 16 repos [0 original], 19 contributions in past year [0 commits]). 0 relevant Python/AI repositories identified. Growth edge to probe in interview: limited redis or backend caching evidence.</w:t>
         <w:br/>
       </w:r>
     </w:p>

</xml_diff>

<commit_message>
docs: update README with video demo link, UI showcase screenshots, and documentation
</commit_message>
<xml_diff>
--- a/output/results.docx
+++ b/output/results.docx
@@ -41,7 +41,7 @@
         <w:br/>
       </w:r>
       <w:r>
-        <w:t>• Average Score (Eligible): 61.6 / 100</w:t>
+        <w:t>• Average Score (Eligible): 66.2 / 100</w:t>
         <w:br/>
       </w:r>
     </w:p>
@@ -270,6 +270,192 @@
           </w:tcPr>
           <w:p>
             <w:r>
+              <w:t>Sumaiya Sultana Shaik</w:t>
+            </w:r>
+          </w:p>
+        </w:tc>
+        <w:tc>
+          <w:tcPr>
+            <w:tcW w:type="dxa" w:w="1440"/>
+          </w:tcPr>
+          <w:p>
+            <w:r>
+              <w:t>sultanasumaiya623@gmail.com</w:t>
+            </w:r>
+          </w:p>
+        </w:tc>
+        <w:tc>
+          <w:tcPr>
+            <w:tcW w:type="dxa" w:w="1440"/>
+          </w:tcPr>
+          <w:p>
+            <w:r>
+              <w:t>+91 97015 28467</w:t>
+            </w:r>
+          </w:p>
+        </w:tc>
+        <w:tc>
+          <w:tcPr>
+            <w:tcW w:type="dxa" w:w="1440"/>
+          </w:tcPr>
+          <w:p>
+            <w:r>
+              <w:t>82.5</w:t>
+            </w:r>
+          </w:p>
+        </w:tc>
+        <w:tc>
+          <w:tcPr>
+            <w:tcW w:type="dxa" w:w="1440"/>
+          </w:tcPr>
+          <w:p>
+            <w:r>
+              <w:t>Active Builder</w:t>
+            </w:r>
+          </w:p>
+        </w:tc>
+      </w:tr>
+      <w:tr>
+        <w:tc>
+          <w:tcPr>
+            <w:tcW w:type="dxa" w:w="1440"/>
+          </w:tcPr>
+          <w:p>
+            <w:r>
+              <w:t>#4</w:t>
+            </w:r>
+          </w:p>
+        </w:tc>
+        <w:tc>
+          <w:tcPr>
+            <w:tcW w:type="dxa" w:w="1440"/>
+          </w:tcPr>
+          <w:p>
+            <w:r>
+              <w:t>Hari Shanker Sharma</w:t>
+            </w:r>
+          </w:p>
+        </w:tc>
+        <w:tc>
+          <w:tcPr>
+            <w:tcW w:type="dxa" w:w="1440"/>
+          </w:tcPr>
+          <w:p>
+            <w:r>
+              <w:t>harishankersharma648@gmail.com</w:t>
+            </w:r>
+          </w:p>
+        </w:tc>
+        <w:tc>
+          <w:tcPr>
+            <w:tcW w:type="dxa" w:w="1440"/>
+          </w:tcPr>
+          <w:p>
+            <w:r>
+              <w:t>+91 8801109700</w:t>
+            </w:r>
+          </w:p>
+        </w:tc>
+        <w:tc>
+          <w:tcPr>
+            <w:tcW w:type="dxa" w:w="1440"/>
+          </w:tcPr>
+          <w:p>
+            <w:r>
+              <w:t>82.5</w:t>
+            </w:r>
+          </w:p>
+        </w:tc>
+        <w:tc>
+          <w:tcPr>
+            <w:tcW w:type="dxa" w:w="1440"/>
+          </w:tcPr>
+          <w:p>
+            <w:r>
+              <w:t>Veteran Builder</w:t>
+            </w:r>
+          </w:p>
+        </w:tc>
+      </w:tr>
+      <w:tr>
+        <w:tc>
+          <w:tcPr>
+            <w:tcW w:type="dxa" w:w="1440"/>
+          </w:tcPr>
+          <w:p>
+            <w:r>
+              <w:t>#5</w:t>
+            </w:r>
+          </w:p>
+        </w:tc>
+        <w:tc>
+          <w:tcPr>
+            <w:tcW w:type="dxa" w:w="1440"/>
+          </w:tcPr>
+          <w:p>
+            <w:r>
+              <w:t>Arjun Kumar</w:t>
+            </w:r>
+          </w:p>
+        </w:tc>
+        <w:tc>
+          <w:tcPr>
+            <w:tcW w:type="dxa" w:w="1440"/>
+          </w:tcPr>
+          <w:p>
+            <w:r>
+              <w:t>roy.prajapat.143@gmail.com</w:t>
+            </w:r>
+          </w:p>
+        </w:tc>
+        <w:tc>
+          <w:tcPr>
+            <w:tcW w:type="dxa" w:w="1440"/>
+          </w:tcPr>
+          <w:p>
+            <w:r>
+              <w:t>+91-6396303191</w:t>
+            </w:r>
+          </w:p>
+        </w:tc>
+        <w:tc>
+          <w:tcPr>
+            <w:tcW w:type="dxa" w:w="1440"/>
+          </w:tcPr>
+          <w:p>
+            <w:r>
+              <w:t>81.5</w:t>
+            </w:r>
+          </w:p>
+        </w:tc>
+        <w:tc>
+          <w:tcPr>
+            <w:tcW w:type="dxa" w:w="1440"/>
+          </w:tcPr>
+          <w:p>
+            <w:r>
+              <w:t>Veteran Builder</w:t>
+            </w:r>
+          </w:p>
+        </w:tc>
+      </w:tr>
+      <w:tr>
+        <w:tc>
+          <w:tcPr>
+            <w:tcW w:type="dxa" w:w="1440"/>
+          </w:tcPr>
+          <w:p>
+            <w:r>
+              <w:t>#6</w:t>
+            </w:r>
+          </w:p>
+        </w:tc>
+        <w:tc>
+          <w:tcPr>
+            <w:tcW w:type="dxa" w:w="1440"/>
+          </w:tcPr>
+          <w:p>
+            <w:r>
               <w:t>Gourab Das</w:t>
             </w:r>
           </w:p>
@@ -322,7 +508,193 @@
           </w:tcPr>
           <w:p>
             <w:r>
-              <w:t>#4</w:t>
+              <w:t>#7</w:t>
+            </w:r>
+          </w:p>
+        </w:tc>
+        <w:tc>
+          <w:tcPr>
+            <w:tcW w:type="dxa" w:w="1440"/>
+          </w:tcPr>
+          <w:p>
+            <w:r>
+              <w:t>Vivek Chimnani</w:t>
+            </w:r>
+          </w:p>
+        </w:tc>
+        <w:tc>
+          <w:tcPr>
+            <w:tcW w:type="dxa" w:w="1440"/>
+          </w:tcPr>
+          <w:p>
+            <w:r>
+              <w:t>vivekchimnani4231@gmail.com</w:t>
+            </w:r>
+          </w:p>
+        </w:tc>
+        <w:tc>
+          <w:tcPr>
+            <w:tcW w:type="dxa" w:w="1440"/>
+          </w:tcPr>
+          <w:p>
+            <w:r>
+              <w:t>N/A</w:t>
+            </w:r>
+          </w:p>
+        </w:tc>
+        <w:tc>
+          <w:tcPr>
+            <w:tcW w:type="dxa" w:w="1440"/>
+          </w:tcPr>
+          <w:p>
+            <w:r>
+              <w:t>78.5</w:t>
+            </w:r>
+          </w:p>
+        </w:tc>
+        <w:tc>
+          <w:tcPr>
+            <w:tcW w:type="dxa" w:w="1440"/>
+          </w:tcPr>
+          <w:p>
+            <w:r>
+              <w:t>Veteran Builder</w:t>
+            </w:r>
+          </w:p>
+        </w:tc>
+      </w:tr>
+      <w:tr>
+        <w:tc>
+          <w:tcPr>
+            <w:tcW w:type="dxa" w:w="1440"/>
+          </w:tcPr>
+          <w:p>
+            <w:r>
+              <w:t>#8</w:t>
+            </w:r>
+          </w:p>
+        </w:tc>
+        <w:tc>
+          <w:tcPr>
+            <w:tcW w:type="dxa" w:w="1440"/>
+          </w:tcPr>
+          <w:p>
+            <w:r>
+              <w:t>Yash Maini</w:t>
+            </w:r>
+          </w:p>
+        </w:tc>
+        <w:tc>
+          <w:tcPr>
+            <w:tcW w:type="dxa" w:w="1440"/>
+          </w:tcPr>
+          <w:p>
+            <w:r>
+              <w:t>mainiyash2@gmail.com</w:t>
+            </w:r>
+          </w:p>
+        </w:tc>
+        <w:tc>
+          <w:tcPr>
+            <w:tcW w:type="dxa" w:w="1440"/>
+          </w:tcPr>
+          <w:p>
+            <w:r>
+              <w:t>+91-8920028757</w:t>
+            </w:r>
+          </w:p>
+        </w:tc>
+        <w:tc>
+          <w:tcPr>
+            <w:tcW w:type="dxa" w:w="1440"/>
+          </w:tcPr>
+          <w:p>
+            <w:r>
+              <w:t>78.0</w:t>
+            </w:r>
+          </w:p>
+        </w:tc>
+        <w:tc>
+          <w:tcPr>
+            <w:tcW w:type="dxa" w:w="1440"/>
+          </w:tcPr>
+          <w:p>
+            <w:r>
+              <w:t>Veteran Builder</w:t>
+            </w:r>
+          </w:p>
+        </w:tc>
+      </w:tr>
+      <w:tr>
+        <w:tc>
+          <w:tcPr>
+            <w:tcW w:type="dxa" w:w="1440"/>
+          </w:tcPr>
+          <w:p>
+            <w:r>
+              <w:t>#9</w:t>
+            </w:r>
+          </w:p>
+        </w:tc>
+        <w:tc>
+          <w:tcPr>
+            <w:tcW w:type="dxa" w:w="1440"/>
+          </w:tcPr>
+          <w:p>
+            <w:r>
+              <w:t>Kiran Naregal</w:t>
+            </w:r>
+          </w:p>
+        </w:tc>
+        <w:tc>
+          <w:tcPr>
+            <w:tcW w:type="dxa" w:w="1440"/>
+          </w:tcPr>
+          <w:p>
+            <w:r>
+              <w:t>kirnaregal7@gmail.com</w:t>
+            </w:r>
+          </w:p>
+        </w:tc>
+        <w:tc>
+          <w:tcPr>
+            <w:tcW w:type="dxa" w:w="1440"/>
+          </w:tcPr>
+          <w:p>
+            <w:r>
+              <w:t>9964923041</w:t>
+            </w:r>
+          </w:p>
+        </w:tc>
+        <w:tc>
+          <w:tcPr>
+            <w:tcW w:type="dxa" w:w="1440"/>
+          </w:tcPr>
+          <w:p>
+            <w:r>
+              <w:t>76.5</w:t>
+            </w:r>
+          </w:p>
+        </w:tc>
+        <w:tc>
+          <w:tcPr>
+            <w:tcW w:type="dxa" w:w="1440"/>
+          </w:tcPr>
+          <w:p>
+            <w:r>
+              <w:t>Veteran Builder</w:t>
+            </w:r>
+          </w:p>
+        </w:tc>
+      </w:tr>
+      <w:tr>
+        <w:tc>
+          <w:tcPr>
+            <w:tcW w:type="dxa" w:w="1440"/>
+          </w:tcPr>
+          <w:p>
+            <w:r>
+              <w:t>#10</w:t>
             </w:r>
           </w:p>
         </w:tc>
@@ -384,7 +756,7 @@
           </w:tcPr>
           <w:p>
             <w:r>
-              <w:t>#5</w:t>
+              <w:t>#11</w:t>
             </w:r>
           </w:p>
         </w:tc>
@@ -446,7 +818,7 @@
           </w:tcPr>
           <w:p>
             <w:r>
-              <w:t>#6</w:t>
+              <w:t>#12</w:t>
             </w:r>
           </w:p>
         </w:tc>
@@ -508,7 +880,7 @@
           </w:tcPr>
           <w:p>
             <w:r>
-              <w:t>#7</w:t>
+              <w:t>#13</w:t>
             </w:r>
           </w:p>
         </w:tc>
@@ -518,7 +890,7 @@
           </w:tcPr>
           <w:p>
             <w:r>
-              <w:t>Hari Shanker Sharma</w:t>
+              <w:t>Jyandeep Baishya</w:t>
             </w:r>
           </w:p>
         </w:tc>
@@ -528,7 +900,7 @@
           </w:tcPr>
           <w:p>
             <w:r>
-              <w:t>harishankersharma648@gmail.com</w:t>
+              <w:t>craftzyan@gmail.com</w:t>
             </w:r>
           </w:p>
         </w:tc>
@@ -538,7 +910,7 @@
           </w:tcPr>
           <w:p>
             <w:r>
-              <w:t>+91 8801109700</w:t>
+              <w:t>6002590335</w:t>
             </w:r>
           </w:p>
         </w:tc>
@@ -548,7 +920,7 @@
           </w:tcPr>
           <w:p>
             <w:r>
-              <w:t>73.5</w:t>
+              <w:t>73.0</w:t>
             </w:r>
           </w:p>
         </w:tc>
@@ -558,7 +930,7 @@
           </w:tcPr>
           <w:p>
             <w:r>
-              <w:t>Unverified (Rate Limited)</w:t>
+              <w:t>Veteran Builder</w:t>
             </w:r>
           </w:p>
         </w:tc>
@@ -570,7 +942,7 @@
           </w:tcPr>
           <w:p>
             <w:r>
-              <w:t>#8</w:t>
+              <w:t>#14</w:t>
             </w:r>
           </w:p>
         </w:tc>
@@ -580,7 +952,7 @@
           </w:tcPr>
           <w:p>
             <w:r>
-              <w:t>Sumaiya Sultana Shaik</w:t>
+              <w:t>Nevil Jasmin Mehta</w:t>
             </w:r>
           </w:p>
         </w:tc>
@@ -590,7 +962,7 @@
           </w:tcPr>
           <w:p>
             <w:r>
-              <w:t>sultanasumaiya623@gmail.com</w:t>
+              <w:t>nevilmehta5@gmail.com</w:t>
             </w:r>
           </w:p>
         </w:tc>
@@ -600,131 +972,7 @@
           </w:tcPr>
           <w:p>
             <w:r>
-              <w:t>+91 97015 28467</w:t>
-            </w:r>
-          </w:p>
-        </w:tc>
-        <w:tc>
-          <w:tcPr>
-            <w:tcW w:type="dxa" w:w="1440"/>
-          </w:tcPr>
-          <w:p>
-            <w:r>
-              <w:t>72.5</w:t>
-            </w:r>
-          </w:p>
-        </w:tc>
-        <w:tc>
-          <w:tcPr>
-            <w:tcW w:type="dxa" w:w="1440"/>
-          </w:tcPr>
-          <w:p>
-            <w:r>
-              <w:t>Unverified (Rate Limited)</w:t>
-            </w:r>
-          </w:p>
-        </w:tc>
-      </w:tr>
-      <w:tr>
-        <w:tc>
-          <w:tcPr>
-            <w:tcW w:type="dxa" w:w="1440"/>
-          </w:tcPr>
-          <w:p>
-            <w:r>
-              <w:t>#9</w:t>
-            </w:r>
-          </w:p>
-        </w:tc>
-        <w:tc>
-          <w:tcPr>
-            <w:tcW w:type="dxa" w:w="1440"/>
-          </w:tcPr>
-          <w:p>
-            <w:r>
-              <w:t>Arjun Kumar</w:t>
-            </w:r>
-          </w:p>
-        </w:tc>
-        <w:tc>
-          <w:tcPr>
-            <w:tcW w:type="dxa" w:w="1440"/>
-          </w:tcPr>
-          <w:p>
-            <w:r>
-              <w:t>roy.prajapat.143@gmail.com</w:t>
-            </w:r>
-          </w:p>
-        </w:tc>
-        <w:tc>
-          <w:tcPr>
-            <w:tcW w:type="dxa" w:w="1440"/>
-          </w:tcPr>
-          <w:p>
-            <w:r>
-              <w:t>+91-6396303191</w:t>
-            </w:r>
-          </w:p>
-        </w:tc>
-        <w:tc>
-          <w:tcPr>
-            <w:tcW w:type="dxa" w:w="1440"/>
-          </w:tcPr>
-          <w:p>
-            <w:r>
-              <w:t>71.5</w:t>
-            </w:r>
-          </w:p>
-        </w:tc>
-        <w:tc>
-          <w:tcPr>
-            <w:tcW w:type="dxa" w:w="1440"/>
-          </w:tcPr>
-          <w:p>
-            <w:r>
-              <w:t>Unverified (Rate Limited)</w:t>
-            </w:r>
-          </w:p>
-        </w:tc>
-      </w:tr>
-      <w:tr>
-        <w:tc>
-          <w:tcPr>
-            <w:tcW w:type="dxa" w:w="1440"/>
-          </w:tcPr>
-          <w:p>
-            <w:r>
-              <w:t>#10</w:t>
-            </w:r>
-          </w:p>
-        </w:tc>
-        <w:tc>
-          <w:tcPr>
-            <w:tcW w:type="dxa" w:w="1440"/>
-          </w:tcPr>
-          <w:p>
-            <w:r>
-              <w:t>Kiran Naregal</w:t>
-            </w:r>
-          </w:p>
-        </w:tc>
-        <w:tc>
-          <w:tcPr>
-            <w:tcW w:type="dxa" w:w="1440"/>
-          </w:tcPr>
-          <w:p>
-            <w:r>
-              <w:t>kirnaregal7@gmail.com</w:t>
-            </w:r>
-          </w:p>
-        </w:tc>
-        <w:tc>
-          <w:tcPr>
-            <w:tcW w:type="dxa" w:w="1440"/>
-          </w:tcPr>
-          <w:p>
-            <w:r>
-              <w:t>9964923041</w:t>
+              <w:t>+91-8347062282</w:t>
             </w:r>
           </w:p>
         </w:tc>
@@ -744,7 +992,7 @@
           </w:tcPr>
           <w:p>
             <w:r>
-              <w:t>Unverified (Rate Limited)</w:t>
+              <w:t>Veteran Builder</w:t>
             </w:r>
           </w:p>
         </w:tc>
@@ -756,7 +1004,7 @@
           </w:tcPr>
           <w:p>
             <w:r>
-              <w:t>#11</w:t>
+              <w:t>#15</w:t>
             </w:r>
           </w:p>
         </w:tc>
@@ -766,7 +1014,7 @@
           </w:tcPr>
           <w:p>
             <w:r>
-              <w:t>Vivek Chimnani</w:t>
+              <w:t>Krishan Kant</w:t>
             </w:r>
           </w:p>
         </w:tc>
@@ -776,7 +1024,7 @@
           </w:tcPr>
           <w:p>
             <w:r>
-              <w:t>vivekchimnani4231@gmail.com</w:t>
+              <w:t>krishankantptu@gmail.com</w:t>
             </w:r>
           </w:p>
         </w:tc>
@@ -786,7 +1034,7 @@
           </w:tcPr>
           <w:p>
             <w:r>
-              <w:t>N/A</w:t>
+              <w:t>+91-6204142591</w:t>
             </w:r>
           </w:p>
         </w:tc>
@@ -796,7 +1044,7 @@
           </w:tcPr>
           <w:p>
             <w:r>
-              <w:t>68.5</w:t>
+              <w:t>70.0</w:t>
             </w:r>
           </w:p>
         </w:tc>
@@ -806,7 +1054,7 @@
           </w:tcPr>
           <w:p>
             <w:r>
-              <w:t>Unverified (Rate Limited)</w:t>
+              <w:t>Veteran Builder</w:t>
             </w:r>
           </w:p>
         </w:tc>
@@ -818,69 +1066,7 @@
           </w:tcPr>
           <w:p>
             <w:r>
-              <w:t>#12</w:t>
-            </w:r>
-          </w:p>
-        </w:tc>
-        <w:tc>
-          <w:tcPr>
-            <w:tcW w:type="dxa" w:w="1440"/>
-          </w:tcPr>
-          <w:p>
-            <w:r>
-              <w:t>Yash Maini</w:t>
-            </w:r>
-          </w:p>
-        </w:tc>
-        <w:tc>
-          <w:tcPr>
-            <w:tcW w:type="dxa" w:w="1440"/>
-          </w:tcPr>
-          <w:p>
-            <w:r>
-              <w:t>mainiyash2@gmail.com</w:t>
-            </w:r>
-          </w:p>
-        </w:tc>
-        <w:tc>
-          <w:tcPr>
-            <w:tcW w:type="dxa" w:w="1440"/>
-          </w:tcPr>
-          <w:p>
-            <w:r>
-              <w:t>+91-8920028757</w:t>
-            </w:r>
-          </w:p>
-        </w:tc>
-        <w:tc>
-          <w:tcPr>
-            <w:tcW w:type="dxa" w:w="1440"/>
-          </w:tcPr>
-          <w:p>
-            <w:r>
-              <w:t>68.0</w:t>
-            </w:r>
-          </w:p>
-        </w:tc>
-        <w:tc>
-          <w:tcPr>
-            <w:tcW w:type="dxa" w:w="1440"/>
-          </w:tcPr>
-          <w:p>
-            <w:r>
-              <w:t>Unverified (Rate Limited)</w:t>
-            </w:r>
-          </w:p>
-        </w:tc>
-      </w:tr>
-      <w:tr>
-        <w:tc>
-          <w:tcPr>
-            <w:tcW w:type="dxa" w:w="1440"/>
-          </w:tcPr>
-          <w:p>
-            <w:r>
-              <w:t>#13</w:t>
+              <w:t>#16</w:t>
             </w:r>
           </w:p>
         </w:tc>
@@ -942,7 +1128,7 @@
           </w:tcPr>
           <w:p>
             <w:r>
-              <w:t>#14</w:t>
+              <w:t>#17</w:t>
             </w:r>
           </w:p>
         </w:tc>
@@ -952,7 +1138,7 @@
           </w:tcPr>
           <w:p>
             <w:r>
-              <w:t>Jyandeep Baishya</w:t>
+              <w:t>Priyanshu Kumar</w:t>
             </w:r>
           </w:p>
         </w:tc>
@@ -962,7 +1148,7 @@
           </w:tcPr>
           <w:p>
             <w:r>
-              <w:t>craftzyan@gmail.com</w:t>
+              <w:t>krpriyanshu2805@gmail.com</w:t>
             </w:r>
           </w:p>
         </w:tc>
@@ -972,7 +1158,7 @@
           </w:tcPr>
           <w:p>
             <w:r>
-              <w:t>6002590335</w:t>
+              <w:t>+91 8210008947</w:t>
             </w:r>
           </w:p>
         </w:tc>
@@ -992,7 +1178,7 @@
           </w:tcPr>
           <w:p>
             <w:r>
-              <w:t>Unverified (Rate Limited)</w:t>
+              <w:t>Veteran Builder</w:t>
             </w:r>
           </w:p>
         </w:tc>
@@ -1004,7 +1190,69 @@
           </w:tcPr>
           <w:p>
             <w:r>
-              <w:t>#15</w:t>
+              <w:t>#18</w:t>
+            </w:r>
+          </w:p>
+        </w:tc>
+        <w:tc>
+          <w:tcPr>
+            <w:tcW w:type="dxa" w:w="1440"/>
+          </w:tcPr>
+          <w:p>
+            <w:r>
+              <w:t>P V Jayavardhana Sai</w:t>
+            </w:r>
+          </w:p>
+        </w:tc>
+        <w:tc>
+          <w:tcPr>
+            <w:tcW w:type="dxa" w:w="1440"/>
+          </w:tcPr>
+          <w:p>
+            <w:r>
+              <w:t>pvjayavardhan6@gmail.com</w:t>
+            </w:r>
+          </w:p>
+        </w:tc>
+        <w:tc>
+          <w:tcPr>
+            <w:tcW w:type="dxa" w:w="1440"/>
+          </w:tcPr>
+          <w:p>
+            <w:r>
+              <w:t>+91 99663 46173</w:t>
+            </w:r>
+          </w:p>
+        </w:tc>
+        <w:tc>
+          <w:tcPr>
+            <w:tcW w:type="dxa" w:w="1440"/>
+          </w:tcPr>
+          <w:p>
+            <w:r>
+              <w:t>62.0</w:t>
+            </w:r>
+          </w:p>
+        </w:tc>
+        <w:tc>
+          <w:tcPr>
+            <w:tcW w:type="dxa" w:w="1440"/>
+          </w:tcPr>
+          <w:p>
+            <w:r>
+              <w:t>Veteran Builder</w:t>
+            </w:r>
+          </w:p>
+        </w:tc>
+      </w:tr>
+      <w:tr>
+        <w:tc>
+          <w:tcPr>
+            <w:tcW w:type="dxa" w:w="1440"/>
+          </w:tcPr>
+          <w:p>
+            <w:r>
+              <w:t>#19</w:t>
             </w:r>
           </w:p>
         </w:tc>
@@ -1066,131 +1314,7 @@
           </w:tcPr>
           <w:p>
             <w:r>
-              <w:t>#16</w:t>
-            </w:r>
-          </w:p>
-        </w:tc>
-        <w:tc>
-          <w:tcPr>
-            <w:tcW w:type="dxa" w:w="1440"/>
-          </w:tcPr>
-          <w:p>
-            <w:r>
-              <w:t>Krishan Kant</w:t>
-            </w:r>
-          </w:p>
-        </w:tc>
-        <w:tc>
-          <w:tcPr>
-            <w:tcW w:type="dxa" w:w="1440"/>
-          </w:tcPr>
-          <w:p>
-            <w:r>
-              <w:t>krishankantptu@gmail.com</w:t>
-            </w:r>
-          </w:p>
-        </w:tc>
-        <w:tc>
-          <w:tcPr>
-            <w:tcW w:type="dxa" w:w="1440"/>
-          </w:tcPr>
-          <w:p>
-            <w:r>
-              <w:t>+91-6204142591</w:t>
-            </w:r>
-          </w:p>
-        </w:tc>
-        <w:tc>
-          <w:tcPr>
-            <w:tcW w:type="dxa" w:w="1440"/>
-          </w:tcPr>
-          <w:p>
-            <w:r>
-              <w:t>61.0</w:t>
-            </w:r>
-          </w:p>
-        </w:tc>
-        <w:tc>
-          <w:tcPr>
-            <w:tcW w:type="dxa" w:w="1440"/>
-          </w:tcPr>
-          <w:p>
-            <w:r>
-              <w:t>Unverified (Rate Limited)</w:t>
-            </w:r>
-          </w:p>
-        </w:tc>
-      </w:tr>
-      <w:tr>
-        <w:tc>
-          <w:tcPr>
-            <w:tcW w:type="dxa" w:w="1440"/>
-          </w:tcPr>
-          <w:p>
-            <w:r>
-              <w:t>#17</w:t>
-            </w:r>
-          </w:p>
-        </w:tc>
-        <w:tc>
-          <w:tcPr>
-            <w:tcW w:type="dxa" w:w="1440"/>
-          </w:tcPr>
-          <w:p>
-            <w:r>
-              <w:t>Nevil Jasmin Mehta</w:t>
-            </w:r>
-          </w:p>
-        </w:tc>
-        <w:tc>
-          <w:tcPr>
-            <w:tcW w:type="dxa" w:w="1440"/>
-          </w:tcPr>
-          <w:p>
-            <w:r>
-              <w:t>nevilmehta5@gmail.com</w:t>
-            </w:r>
-          </w:p>
-        </w:tc>
-        <w:tc>
-          <w:tcPr>
-            <w:tcW w:type="dxa" w:w="1440"/>
-          </w:tcPr>
-          <w:p>
-            <w:r>
-              <w:t>+91-8347062282</w:t>
-            </w:r>
-          </w:p>
-        </w:tc>
-        <w:tc>
-          <w:tcPr>
-            <w:tcW w:type="dxa" w:w="1440"/>
-          </w:tcPr>
-          <w:p>
-            <w:r>
-              <w:t>60.5</w:t>
-            </w:r>
-          </w:p>
-        </w:tc>
-        <w:tc>
-          <w:tcPr>
-            <w:tcW w:type="dxa" w:w="1440"/>
-          </w:tcPr>
-          <w:p>
-            <w:r>
-              <w:t>Unverified (Rate Limited)</w:t>
-            </w:r>
-          </w:p>
-        </w:tc>
-      </w:tr>
-      <w:tr>
-        <w:tc>
-          <w:tcPr>
-            <w:tcW w:type="dxa" w:w="1440"/>
-          </w:tcPr>
-          <w:p>
-            <w:r>
-              <w:t>#18</w:t>
+              <w:t>#20</w:t>
             </w:r>
           </w:p>
         </w:tc>
@@ -1252,7 +1376,131 @@
           </w:tcPr>
           <w:p>
             <w:r>
-              <w:t>#19</w:t>
+              <w:t>#21</w:t>
+            </w:r>
+          </w:p>
+        </w:tc>
+        <w:tc>
+          <w:tcPr>
+            <w:tcW w:type="dxa" w:w="1440"/>
+          </w:tcPr>
+          <w:p>
+            <w:r>
+              <w:t>Raj Thumar</w:t>
+            </w:r>
+          </w:p>
+        </w:tc>
+        <w:tc>
+          <w:tcPr>
+            <w:tcW w:type="dxa" w:w="1440"/>
+          </w:tcPr>
+          <w:p>
+            <w:r>
+              <w:t>thumarraj999@gmail.com</w:t>
+            </w:r>
+          </w:p>
+        </w:tc>
+        <w:tc>
+          <w:tcPr>
+            <w:tcW w:type="dxa" w:w="1440"/>
+          </w:tcPr>
+          <w:p>
+            <w:r>
+              <w:t>+91 9104382983</w:t>
+            </w:r>
+          </w:p>
+        </w:tc>
+        <w:tc>
+          <w:tcPr>
+            <w:tcW w:type="dxa" w:w="1440"/>
+          </w:tcPr>
+          <w:p>
+            <w:r>
+              <w:t>59.5</w:t>
+            </w:r>
+          </w:p>
+        </w:tc>
+        <w:tc>
+          <w:tcPr>
+            <w:tcW w:type="dxa" w:w="1440"/>
+          </w:tcPr>
+          <w:p>
+            <w:r>
+              <w:t>Veteran Builder</w:t>
+            </w:r>
+          </w:p>
+        </w:tc>
+      </w:tr>
+      <w:tr>
+        <w:tc>
+          <w:tcPr>
+            <w:tcW w:type="dxa" w:w="1440"/>
+          </w:tcPr>
+          <w:p>
+            <w:r>
+              <w:t>#22</w:t>
+            </w:r>
+          </w:p>
+        </w:tc>
+        <w:tc>
+          <w:tcPr>
+            <w:tcW w:type="dxa" w:w="1440"/>
+          </w:tcPr>
+          <w:p>
+            <w:r>
+              <w:t>Shubhanshu Navadiya</w:t>
+            </w:r>
+          </w:p>
+        </w:tc>
+        <w:tc>
+          <w:tcPr>
+            <w:tcW w:type="dxa" w:w="1440"/>
+          </w:tcPr>
+          <w:p>
+            <w:r>
+              <w:t>subhnavadiya@gmail.com</w:t>
+            </w:r>
+          </w:p>
+        </w:tc>
+        <w:tc>
+          <w:tcPr>
+            <w:tcW w:type="dxa" w:w="1440"/>
+          </w:tcPr>
+          <w:p>
+            <w:r>
+              <w:t>+91 9031132507</w:t>
+            </w:r>
+          </w:p>
+        </w:tc>
+        <w:tc>
+          <w:tcPr>
+            <w:tcW w:type="dxa" w:w="1440"/>
+          </w:tcPr>
+          <w:p>
+            <w:r>
+              <w:t>59.0</w:t>
+            </w:r>
+          </w:p>
+        </w:tc>
+        <w:tc>
+          <w:tcPr>
+            <w:tcW w:type="dxa" w:w="1440"/>
+          </w:tcPr>
+          <w:p>
+            <w:r>
+              <w:t>Veteran Builder</w:t>
+            </w:r>
+          </w:p>
+        </w:tc>
+      </w:tr>
+      <w:tr>
+        <w:tc>
+          <w:tcPr>
+            <w:tcW w:type="dxa" w:w="1440"/>
+          </w:tcPr>
+          <w:p>
+            <w:r>
+              <w:t>#23</w:t>
             </w:r>
           </w:p>
         </w:tc>
@@ -1314,7 +1562,69 @@
           </w:tcPr>
           <w:p>
             <w:r>
-              <w:t>#20</w:t>
+              <w:t>#24</w:t>
+            </w:r>
+          </w:p>
+        </w:tc>
+        <w:tc>
+          <w:tcPr>
+            <w:tcW w:type="dxa" w:w="1440"/>
+          </w:tcPr>
+          <w:p>
+            <w:r>
+              <w:t>Aditi Kala</w:t>
+            </w:r>
+          </w:p>
+        </w:tc>
+        <w:tc>
+          <w:tcPr>
+            <w:tcW w:type="dxa" w:w="1440"/>
+          </w:tcPr>
+          <w:p>
+            <w:r>
+              <w:t>aditi25.kala@gmail.com</w:t>
+            </w:r>
+          </w:p>
+        </w:tc>
+        <w:tc>
+          <w:tcPr>
+            <w:tcW w:type="dxa" w:w="1440"/>
+          </w:tcPr>
+          <w:p>
+            <w:r>
+              <w:t>+91-8368407039</w:t>
+            </w:r>
+          </w:p>
+        </w:tc>
+        <w:tc>
+          <w:tcPr>
+            <w:tcW w:type="dxa" w:w="1440"/>
+          </w:tcPr>
+          <w:p>
+            <w:r>
+              <w:t>58.0</w:t>
+            </w:r>
+          </w:p>
+        </w:tc>
+        <w:tc>
+          <w:tcPr>
+            <w:tcW w:type="dxa" w:w="1440"/>
+          </w:tcPr>
+          <w:p>
+            <w:r>
+              <w:t>Veteran Builder</w:t>
+            </w:r>
+          </w:p>
+        </w:tc>
+      </w:tr>
+      <w:tr>
+        <w:tc>
+          <w:tcPr>
+            <w:tcW w:type="dxa" w:w="1440"/>
+          </w:tcPr>
+          <w:p>
+            <w:r>
+              <w:t>#25</w:t>
             </w:r>
           </w:p>
         </w:tc>
@@ -1376,7 +1686,7 @@
           </w:tcPr>
           <w:p>
             <w:r>
-              <w:t>#21</w:t>
+              <w:t>#26</w:t>
             </w:r>
           </w:p>
         </w:tc>
@@ -1386,7 +1696,7 @@
           </w:tcPr>
           <w:p>
             <w:r>
-              <w:t>Aditi Kala</w:t>
+              <w:t>Aswin Raj R</w:t>
             </w:r>
           </w:p>
         </w:tc>
@@ -1396,7 +1706,7 @@
           </w:tcPr>
           <w:p>
             <w:r>
-              <w:t>aditi25.kala@gmail.com</w:t>
+              <w:t>aswinrajr12@gmail.com</w:t>
             </w:r>
           </w:p>
         </w:tc>
@@ -1406,7 +1716,7 @@
           </w:tcPr>
           <w:p>
             <w:r>
-              <w:t>+91-8368407039</w:t>
+              <w:t>+91-7994013148</w:t>
             </w:r>
           </w:p>
         </w:tc>
@@ -1426,7 +1736,7 @@
           </w:tcPr>
           <w:p>
             <w:r>
-              <w:t>Veteran Builder</w:t>
+              <w:t>Active Builder</w:t>
             </w:r>
           </w:p>
         </w:tc>
@@ -1438,193 +1748,7 @@
           </w:tcPr>
           <w:p>
             <w:r>
-              <w:t>#22</w:t>
-            </w:r>
-          </w:p>
-        </w:tc>
-        <w:tc>
-          <w:tcPr>
-            <w:tcW w:type="dxa" w:w="1440"/>
-          </w:tcPr>
-          <w:p>
-            <w:r>
-              <w:t>Priyanshu Kumar</w:t>
-            </w:r>
-          </w:p>
-        </w:tc>
-        <w:tc>
-          <w:tcPr>
-            <w:tcW w:type="dxa" w:w="1440"/>
-          </w:tcPr>
-          <w:p>
-            <w:r>
-              <w:t>krpriyanshu2805@gmail.com</w:t>
-            </w:r>
-          </w:p>
-        </w:tc>
-        <w:tc>
-          <w:tcPr>
-            <w:tcW w:type="dxa" w:w="1440"/>
-          </w:tcPr>
-          <w:p>
-            <w:r>
-              <w:t>+91 8210008947</w:t>
-            </w:r>
-          </w:p>
-        </w:tc>
-        <w:tc>
-          <w:tcPr>
-            <w:tcW w:type="dxa" w:w="1440"/>
-          </w:tcPr>
-          <w:p>
-            <w:r>
-              <w:t>55.5</w:t>
-            </w:r>
-          </w:p>
-        </w:tc>
-        <w:tc>
-          <w:tcPr>
-            <w:tcW w:type="dxa" w:w="1440"/>
-          </w:tcPr>
-          <w:p>
-            <w:r>
-              <w:t>Unverified (Rate Limited)</w:t>
-            </w:r>
-          </w:p>
-        </w:tc>
-      </w:tr>
-      <w:tr>
-        <w:tc>
-          <w:tcPr>
-            <w:tcW w:type="dxa" w:w="1440"/>
-          </w:tcPr>
-          <w:p>
-            <w:r>
-              <w:t>#23</w:t>
-            </w:r>
-          </w:p>
-        </w:tc>
-        <w:tc>
-          <w:tcPr>
-            <w:tcW w:type="dxa" w:w="1440"/>
-          </w:tcPr>
-          <w:p>
-            <w:r>
-              <w:t>P V Jayavardhana Sai</w:t>
-            </w:r>
-          </w:p>
-        </w:tc>
-        <w:tc>
-          <w:tcPr>
-            <w:tcW w:type="dxa" w:w="1440"/>
-          </w:tcPr>
-          <w:p>
-            <w:r>
-              <w:t>pvjayavardhan6@gmail.com</w:t>
-            </w:r>
-          </w:p>
-        </w:tc>
-        <w:tc>
-          <w:tcPr>
-            <w:tcW w:type="dxa" w:w="1440"/>
-          </w:tcPr>
-          <w:p>
-            <w:r>
-              <w:t>+91 99663 46173</w:t>
-            </w:r>
-          </w:p>
-        </w:tc>
-        <w:tc>
-          <w:tcPr>
-            <w:tcW w:type="dxa" w:w="1440"/>
-          </w:tcPr>
-          <w:p>
-            <w:r>
-              <w:t>54.5</w:t>
-            </w:r>
-          </w:p>
-        </w:tc>
-        <w:tc>
-          <w:tcPr>
-            <w:tcW w:type="dxa" w:w="1440"/>
-          </w:tcPr>
-          <w:p>
-            <w:r>
-              <w:t>Unverified (Rate Limited)</w:t>
-            </w:r>
-          </w:p>
-        </w:tc>
-      </w:tr>
-      <w:tr>
-        <w:tc>
-          <w:tcPr>
-            <w:tcW w:type="dxa" w:w="1440"/>
-          </w:tcPr>
-          <w:p>
-            <w:r>
-              <w:t>#24</w:t>
-            </w:r>
-          </w:p>
-        </w:tc>
-        <w:tc>
-          <w:tcPr>
-            <w:tcW w:type="dxa" w:w="1440"/>
-          </w:tcPr>
-          <w:p>
-            <w:r>
-              <w:t>Raj Thumar</w:t>
-            </w:r>
-          </w:p>
-        </w:tc>
-        <w:tc>
-          <w:tcPr>
-            <w:tcW w:type="dxa" w:w="1440"/>
-          </w:tcPr>
-          <w:p>
-            <w:r>
-              <w:t>thumarraj999@gmail.com</w:t>
-            </w:r>
-          </w:p>
-        </w:tc>
-        <w:tc>
-          <w:tcPr>
-            <w:tcW w:type="dxa" w:w="1440"/>
-          </w:tcPr>
-          <w:p>
-            <w:r>
-              <w:t>+91 9104382983</w:t>
-            </w:r>
-          </w:p>
-        </w:tc>
-        <w:tc>
-          <w:tcPr>
-            <w:tcW w:type="dxa" w:w="1440"/>
-          </w:tcPr>
-          <w:p>
-            <w:r>
-              <w:t>54.5</w:t>
-            </w:r>
-          </w:p>
-        </w:tc>
-        <w:tc>
-          <w:tcPr>
-            <w:tcW w:type="dxa" w:w="1440"/>
-          </w:tcPr>
-          <w:p>
-            <w:r>
-              <w:t>Unverified (Rate Limited)</w:t>
-            </w:r>
-          </w:p>
-        </w:tc>
-      </w:tr>
-      <w:tr>
-        <w:tc>
-          <w:tcPr>
-            <w:tcW w:type="dxa" w:w="1440"/>
-          </w:tcPr>
-          <w:p>
-            <w:r>
-              <w:t>#25</w:t>
+              <w:t>#27</w:t>
             </w:r>
           </w:p>
         </w:tc>
@@ -1686,7 +1810,7 @@
           </w:tcPr>
           <w:p>
             <w:r>
-              <w:t>#26</w:t>
+              <w:t>#28</w:t>
             </w:r>
           </w:p>
         </w:tc>
@@ -1696,7 +1820,7 @@
           </w:tcPr>
           <w:p>
             <w:r>
-              <w:t>Shubhanshu Navadiya</w:t>
+              <w:t>Higher Secondary Science Pcmb</w:t>
             </w:r>
           </w:p>
         </w:tc>
@@ -1706,7 +1830,7 @@
           </w:tcPr>
           <w:p>
             <w:r>
-              <w:t>subhnavadiya@gmail.com</w:t>
+              <w:t>manojkumar.k.r0904@gmail.com</w:t>
             </w:r>
           </w:p>
         </w:tc>
@@ -1716,7 +1840,7 @@
           </w:tcPr>
           <w:p>
             <w:r>
-              <w:t>+91 9031132507</w:t>
+              <w:t>N/A</w:t>
             </w:r>
           </w:p>
         </w:tc>
@@ -1726,7 +1850,7 @@
           </w:tcPr>
           <w:p>
             <w:r>
-              <w:t>51.0</w:t>
+              <w:t>47.0</w:t>
             </w:r>
           </w:p>
         </w:tc>
@@ -1736,7 +1860,7 @@
           </w:tcPr>
           <w:p>
             <w:r>
-              <w:t>Unverified (Rate Limited)</w:t>
+              <w:t>Emerging Developer</w:t>
             </w:r>
           </w:p>
         </w:tc>
@@ -1748,69 +1872,7 @@
           </w:tcPr>
           <w:p>
             <w:r>
-              <w:t>#27</w:t>
-            </w:r>
-          </w:p>
-        </w:tc>
-        <w:tc>
-          <w:tcPr>
-            <w:tcW w:type="dxa" w:w="1440"/>
-          </w:tcPr>
-          <w:p>
-            <w:r>
-              <w:t>Aswin Raj R</w:t>
-            </w:r>
-          </w:p>
-        </w:tc>
-        <w:tc>
-          <w:tcPr>
-            <w:tcW w:type="dxa" w:w="1440"/>
-          </w:tcPr>
-          <w:p>
-            <w:r>
-              <w:t>aswinrajr12@gmail.com</w:t>
-            </w:r>
-          </w:p>
-        </w:tc>
-        <w:tc>
-          <w:tcPr>
-            <w:tcW w:type="dxa" w:w="1440"/>
-          </w:tcPr>
-          <w:p>
-            <w:r>
-              <w:t>+91-7994013148</w:t>
-            </w:r>
-          </w:p>
-        </w:tc>
-        <w:tc>
-          <w:tcPr>
-            <w:tcW w:type="dxa" w:w="1440"/>
-          </w:tcPr>
-          <w:p>
-            <w:r>
-              <w:t>48.0</w:t>
-            </w:r>
-          </w:p>
-        </w:tc>
-        <w:tc>
-          <w:tcPr>
-            <w:tcW w:type="dxa" w:w="1440"/>
-          </w:tcPr>
-          <w:p>
-            <w:r>
-              <w:t>Unverified (Rate Limited)</w:t>
-            </w:r>
-          </w:p>
-        </w:tc>
-      </w:tr>
-      <w:tr>
-        <w:tc>
-          <w:tcPr>
-            <w:tcW w:type="dxa" w:w="1440"/>
-          </w:tcPr>
-          <w:p>
-            <w:r>
-              <w:t>#28</w:t>
+              <w:t>#29</w:t>
             </w:r>
           </w:p>
         </w:tc>
@@ -1850,7 +1912,7 @@
           </w:tcPr>
           <w:p>
             <w:r>
-              <w:t>43.0</w:t>
+              <w:t>44.0</w:t>
             </w:r>
           </w:p>
         </w:tc>
@@ -1860,7 +1922,7 @@
           </w:tcPr>
           <w:p>
             <w:r>
-              <w:t>Unverified (Rate Limited)</w:t>
+              <w:t>Active Developer</w:t>
             </w:r>
           </w:p>
         </w:tc>
@@ -1872,7 +1934,69 @@
           </w:tcPr>
           <w:p>
             <w:r>
-              <w:t>#29</w:t>
+              <w:t>#30</w:t>
+            </w:r>
+          </w:p>
+        </w:tc>
+        <w:tc>
+          <w:tcPr>
+            <w:tcW w:type="dxa" w:w="1440"/>
+          </w:tcPr>
+          <w:p>
+            <w:r>
+              <w:t>Dornipadu Karthika Chaitrika</w:t>
+            </w:r>
+          </w:p>
+        </w:tc>
+        <w:tc>
+          <w:tcPr>
+            <w:tcW w:type="dxa" w:w="1440"/>
+          </w:tcPr>
+          <w:p>
+            <w:r>
+              <w:t>dornipadukarthi@gmail.com</w:t>
+            </w:r>
+          </w:p>
+        </w:tc>
+        <w:tc>
+          <w:tcPr>
+            <w:tcW w:type="dxa" w:w="1440"/>
+          </w:tcPr>
+          <w:p>
+            <w:r>
+              <w:t>+91-9014209602</w:t>
+            </w:r>
+          </w:p>
+        </w:tc>
+        <w:tc>
+          <w:tcPr>
+            <w:tcW w:type="dxa" w:w="1440"/>
+          </w:tcPr>
+          <w:p>
+            <w:r>
+              <w:t>44.0</w:t>
+            </w:r>
+          </w:p>
+        </w:tc>
+        <w:tc>
+          <w:tcPr>
+            <w:tcW w:type="dxa" w:w="1440"/>
+          </w:tcPr>
+          <w:p>
+            <w:r>
+              <w:t>Active Builder</w:t>
+            </w:r>
+          </w:p>
+        </w:tc>
+      </w:tr>
+      <w:tr>
+        <w:tc>
+          <w:tcPr>
+            <w:tcW w:type="dxa" w:w="1440"/>
+          </w:tcPr>
+          <w:p>
+            <w:r>
+              <w:t>#31</w:t>
             </w:r>
           </w:p>
         </w:tc>
@@ -1934,130 +2058,6 @@
           </w:tcPr>
           <w:p>
             <w:r>
-              <w:t>#30</w:t>
-            </w:r>
-          </w:p>
-        </w:tc>
-        <w:tc>
-          <w:tcPr>
-            <w:tcW w:type="dxa" w:w="1440"/>
-          </w:tcPr>
-          <w:p>
-            <w:r>
-              <w:t>Higher Secondary Science Pcmb</w:t>
-            </w:r>
-          </w:p>
-        </w:tc>
-        <w:tc>
-          <w:tcPr>
-            <w:tcW w:type="dxa" w:w="1440"/>
-          </w:tcPr>
-          <w:p>
-            <w:r>
-              <w:t>manojkumar.k.r0904@gmail.com</w:t>
-            </w:r>
-          </w:p>
-        </w:tc>
-        <w:tc>
-          <w:tcPr>
-            <w:tcW w:type="dxa" w:w="1440"/>
-          </w:tcPr>
-          <w:p>
-            <w:r>
-              <w:t>N/A</w:t>
-            </w:r>
-          </w:p>
-        </w:tc>
-        <w:tc>
-          <w:tcPr>
-            <w:tcW w:type="dxa" w:w="1440"/>
-          </w:tcPr>
-          <w:p>
-            <w:r>
-              <w:t>41.0</w:t>
-            </w:r>
-          </w:p>
-        </w:tc>
-        <w:tc>
-          <w:tcPr>
-            <w:tcW w:type="dxa" w:w="1440"/>
-          </w:tcPr>
-          <w:p>
-            <w:r>
-              <w:t>Unverified (Rate Limited)</w:t>
-            </w:r>
-          </w:p>
-        </w:tc>
-      </w:tr>
-      <w:tr>
-        <w:tc>
-          <w:tcPr>
-            <w:tcW w:type="dxa" w:w="1440"/>
-          </w:tcPr>
-          <w:p>
-            <w:r>
-              <w:t>#31</w:t>
-            </w:r>
-          </w:p>
-        </w:tc>
-        <w:tc>
-          <w:tcPr>
-            <w:tcW w:type="dxa" w:w="1440"/>
-          </w:tcPr>
-          <w:p>
-            <w:r>
-              <w:t>Dornipadu Karthika Chaitrika</w:t>
-            </w:r>
-          </w:p>
-        </w:tc>
-        <w:tc>
-          <w:tcPr>
-            <w:tcW w:type="dxa" w:w="1440"/>
-          </w:tcPr>
-          <w:p>
-            <w:r>
-              <w:t>dornipadukarthi@gmail.com</w:t>
-            </w:r>
-          </w:p>
-        </w:tc>
-        <w:tc>
-          <w:tcPr>
-            <w:tcW w:type="dxa" w:w="1440"/>
-          </w:tcPr>
-          <w:p>
-            <w:r>
-              <w:t>+91-9014209602</w:t>
-            </w:r>
-          </w:p>
-        </w:tc>
-        <w:tc>
-          <w:tcPr>
-            <w:tcW w:type="dxa" w:w="1440"/>
-          </w:tcPr>
-          <w:p>
-            <w:r>
-              <w:t>35.0</w:t>
-            </w:r>
-          </w:p>
-        </w:tc>
-        <w:tc>
-          <w:tcPr>
-            <w:tcW w:type="dxa" w:w="1440"/>
-          </w:tcPr>
-          <w:p>
-            <w:r>
-              <w:t>Unverified (Rate Limited)</w:t>
-            </w:r>
-          </w:p>
-        </w:tc>
-      </w:tr>
-      <w:tr>
-        <w:tc>
-          <w:tcPr>
-            <w:tcW w:type="dxa" w:w="1440"/>
-          </w:tcPr>
-          <w:p>
-            <w:r>
               <w:t>#32</w:t>
             </w:r>
           </w:p>
@@ -2098,7 +2098,7 @@
           </w:tcPr>
           <w:p>
             <w:r>
-              <w:t>28.0</w:t>
+              <w:t>38.0</w:t>
             </w:r>
           </w:p>
         </w:tc>
@@ -2108,7 +2108,7 @@
           </w:tcPr>
           <w:p>
             <w:r>
-              <w:t>Unverified (Rate Limited)</w:t>
+              <w:t>Veteran Builder</w:t>
             </w:r>
           </w:p>
         </w:tc>
@@ -2185,7 +2185,94 @@
         <w:pStyle w:val="Heading2"/>
       </w:pPr>
       <w:r>
-        <w:t>#3 - Gourab Das (81.5/100)</w:t>
+        <w:t>#3 - Sumaiya Sultana Shaik (82.5/100)</w:t>
+      </w:r>
+    </w:p>
+    <w:p>
+      <w:r>
+        <w:rPr>
+          <w:b/>
+        </w:rPr>
+        <w:t>Contact: sultanasumaiya623@gmail.com | +91 97015 28467 | Resume: candidate_28.pdf</w:t>
+        <w:br/>
+      </w:r>
+      <w:r>
+        <w:t>Score Breakdown: AI Depth: 31.0 | Python: 23.0 | Cloud: 15.0 | GitHub: 10.0 | Eng: 3.5</w:t>
+        <w:br/>
+      </w:r>
+      <w:r>
+        <w:t>GitHub: Active Builder (2.7 yrs, 29 repos, 13 contributions, 0 PRs)</w:t>
+        <w:br/>
+      </w:r>
+      <w:r>
+        <w:t>Evaluation Notes: At 82.5/100, Sumaiya Sultana Shaik stands out through stateful multi-agent orchestration (langgraph/crewai/autogen), complemented by embeddings-based retrieval system. Plus modern python backend framework (fastapi/django) rounds out the build. Core evidence in Python, FastAPI, PostgreSQL, Docker, GCP maps to AI 31.0 and Python 23.0 bands. GitHub profile: Active Builder (2.7 yrs on GitHub, 29 repos [29 original], 13 contributions in past year [0 commits], 3 stars). 14 relevant Python/AI repositories identified. Growth edge to probe in interview: limited redis or backend caching evidence.</w:t>
+        <w:br/>
+      </w:r>
+    </w:p>
+    <w:p>
+      <w:pPr>
+        <w:pStyle w:val="Heading2"/>
+      </w:pPr>
+      <w:r>
+        <w:t>#4 - Hari Shanker Sharma (82.5/100)</w:t>
+      </w:r>
+    </w:p>
+    <w:p>
+      <w:r>
+        <w:rPr>
+          <w:b/>
+        </w:rPr>
+        <w:t>Contact: harishankersharma648@gmail.com | +91 8801109700 | Resume: candidate_41.pdf</w:t>
+        <w:br/>
+      </w:r>
+      <w:r>
+        <w:t>Score Breakdown: AI Depth: 29.0 | Python: 27.0 | Cloud: 14.0 | GitHub: 9.0 | Eng: 3.5</w:t>
+        <w:br/>
+      </w:r>
+      <w:r>
+        <w:t>GitHub: Veteran Builder (6.3 yrs, 30 repos, 116 contributions, 0 PRs)</w:t>
+        <w:br/>
+      </w:r>
+      <w:r>
+        <w:t>Evaluation Notes: Hari Shanker Sharma (82.5/100) impressed with redis caching / in-memory store alongside docker containerization &amp; deployment. Also notable: cloud infrastructure (aws/azure). Depth spans Python, FastAPI, PostgreSQL, Redis, Docker, Kubernetes (cloud 14.0/15, GitHub 9.0/10). Activity: Veteran Builder (6.3 yrs on GitHub, 30 repos [29 original], 116 contributions in past year [0 commits], 5 stars). 6 relevant Python/AI repositories identified. Interview focus should be polishing production hardening, but overall internship readiness is high.</w:t>
+        <w:br/>
+      </w:r>
+    </w:p>
+    <w:p>
+      <w:pPr>
+        <w:pStyle w:val="Heading2"/>
+      </w:pPr>
+      <w:r>
+        <w:t>#5 - Arjun Kumar (81.5/100)</w:t>
+      </w:r>
+    </w:p>
+    <w:p>
+      <w:r>
+        <w:rPr>
+          <w:b/>
+        </w:rPr>
+        <w:t>Contact: roy.prajapat.143@gmail.com | +91-6396303191 | Resume: candidate_08.pdf</w:t>
+        <w:br/>
+      </w:r>
+      <w:r>
+        <w:t>Score Breakdown: AI Depth: 35.0 | Python: 25.0 | Cloud: 8.0 | GitHub: 10.0 | Eng: 3.5</w:t>
+        <w:br/>
+      </w:r>
+      <w:r>
+        <w:t>GitHub: Veteran Builder (3.0 yrs, 26 repos, 226 contributions, 0 PRs)</w:t>
+        <w:br/>
+      </w:r>
+      <w:r>
+        <w:t>Evaluation Notes: Arjun’s standout strength is designing stateful multi-agent systems with LangGraph, supported by a robust Python FastAPI backend. His portfolio highlights 13 relevant AI repositories, including an embeddings-based retrieval pipeline using LangChain and PostgreSQL. While his GitHub activity shows sustained building over three years, the absence of Redis or backend caching evidence remains a notable technical gap. Still, his focus on complex orchestration and RAG architectures makes him a strong fit for our high-volume AI infrastructure team.</w:t>
+        <w:br/>
+      </w:r>
+    </w:p>
+    <w:p>
+      <w:pPr>
+        <w:pStyle w:val="Heading2"/>
+      </w:pPr>
+      <w:r>
+        <w:t>#6 - Gourab Das (81.5/100)</w:t>
       </w:r>
     </w:p>
     <w:p>
@@ -2214,7 +2301,94 @@
         <w:pStyle w:val="Heading2"/>
       </w:pPr>
       <w:r>
-        <w:t>#4 - Vaibhav Wakde (75.5/100)</w:t>
+        <w:t>#7 - Vivek Chimnani (78.5/100)</w:t>
+      </w:r>
+    </w:p>
+    <w:p>
+      <w:r>
+        <w:rPr>
+          <w:b/>
+        </w:rPr>
+        <w:t>Contact: vivekchimnani4231@gmail.com | N/A | Resume: candidate_44.pdf</w:t>
+        <w:br/>
+      </w:r>
+      <w:r>
+        <w:t>Score Breakdown: AI Depth: 24.0 | Python: 27.0 | Cloud: 14.0 | GitHub: 10.0 | Eng: 3.5</w:t>
+        <w:br/>
+      </w:r>
+      <w:r>
+        <w:t>GitHub: Veteran Builder (4.7 yrs, 70 repos, 635 contributions, 0 PRs)</w:t>
+        <w:br/>
+      </w:r>
+      <w:r>
+        <w:t>Evaluation Notes: Vivek Chimnani scored 78.5/100 (AI 24.0/40, Python 27.0/30, Cloud 14.0/15, GitHub 10.0/10), led by stateful multi-agent orchestration (langgraph/crewai/autogen) and async fastapi backend architecture Backed by postgresql with orm / schema migrations. Stack centers on Python, FastAPI, PostgreSQL, Redis. GitHub: Veteran Builder (4.7 yrs on GitHub, 70 repos [25 original], 635 contributions in past year [0 commits]). 3 relevant Python/AI repositories identified. Watch-item: polishing production hardening. Fit for SDE AI internship is strong on shipped agentic depth.</w:t>
+        <w:br/>
+      </w:r>
+    </w:p>
+    <w:p>
+      <w:pPr>
+        <w:pStyle w:val="Heading2"/>
+      </w:pPr>
+      <w:r>
+        <w:t>#8 - Yash Maini (78.0/100)</w:t>
+      </w:r>
+    </w:p>
+    <w:p>
+      <w:r>
+        <w:rPr>
+          <w:b/>
+        </w:rPr>
+        <w:t>Contact: mainiyash2@gmail.com | +91-8920028757 | Resume: candidate_13.pdf</w:t>
+        <w:br/>
+      </w:r>
+      <w:r>
+        <w:t>Score Breakdown: AI Depth: 33.0 | Python: 22.0 | Cloud: 11.0 | GitHub: 10.0 | Eng: 2.0</w:t>
+        <w:br/>
+      </w:r>
+      <w:r>
+        <w:t>GitHub: Veteran Builder (3.8 yrs, 47 repos, 306 contributions, 0 PRs)</w:t>
+        <w:br/>
+      </w:r>
+      <w:r>
+        <w:t>Evaluation Notes: Yash Maini (78.0/100) impressed with postgresql with orm / schema migrations alongside docker containerization &amp; deployment. Also notable: gcp cloud deployment experience. Depth spans Python, FastAPI, Flask, PostgreSQL, Postgres, Docker (cloud 11.0/15, GitHub 10.0/10). Activity: Veteran Builder (3.8 yrs on GitHub, 47 repos [28 original], 306 contributions in past year [0 commits], 11 stars). 22 relevant Python/AI repositories identified. Interview focus should be limited redis or backend caching evidence, but overall internship readiness is high.</w:t>
+        <w:br/>
+      </w:r>
+    </w:p>
+    <w:p>
+      <w:pPr>
+        <w:pStyle w:val="Heading2"/>
+      </w:pPr>
+      <w:r>
+        <w:t>#9 - Kiran Naregal (76.5/100)</w:t>
+      </w:r>
+    </w:p>
+    <w:p>
+      <w:r>
+        <w:rPr>
+          <w:b/>
+        </w:rPr>
+        <w:t>Contact: kirnaregal7@gmail.com | 9964923041 | Resume: candidate_47.pdf</w:t>
+        <w:br/>
+      </w:r>
+      <w:r>
+        <w:t>Score Breakdown: AI Depth: 35.0 | Python: 20.0 | Cloud: 14.0 | GitHub: 6.0 | Eng: 1.5</w:t>
+        <w:br/>
+      </w:r>
+      <w:r>
+        <w:t>GitHub: Veteran Builder (5.4 yrs, 8 repos, 3 contributions, 0 PRs)</w:t>
+        <w:br/>
+      </w:r>
+      <w:r>
+        <w:t>Evaluation Notes: Kiran Naregal (76.5/100) impressed with docker containerization &amp; deployment alongside cloud infrastructure (aws/azure). Also notable: full stack capability (react/next.js/typescript). Depth spans Python, FastAPI, Docker, AWS, LangChain, LangGraph (cloud 14.0/15, GitHub 6.0/10). Activity: Veteran Builder (5.4 yrs on GitHub, 8 repos [8 original], 3 contributions in past year [0 commits]). 1 relevant Python/AI repositories identified. Interview focus should be limited redis or backend caching evidence, but overall internship readiness is high.</w:t>
+        <w:br/>
+      </w:r>
+    </w:p>
+    <w:p>
+      <w:pPr>
+        <w:pStyle w:val="Heading2"/>
+      </w:pPr>
+      <w:r>
+        <w:t>#10 - Vaibhav Wakde (75.5/100)</w:t>
       </w:r>
     </w:p>
     <w:p>
@@ -2243,7 +2417,7 @@
         <w:pStyle w:val="Heading2"/>
       </w:pPr>
       <w:r>
-        <w:t>#5 - Arunima Saha (75.5/100)</w:t>
+        <w:t>#11 - Arunima Saha (75.5/100)</w:t>
       </w:r>
     </w:p>
     <w:p>
@@ -2263,7 +2437,7 @@
         <w:br/>
       </w:r>
       <w:r>
-        <w:t>Evaluation Notes: Arunima Saha (75.5/100) impressed with advanced rag with hybrid search and reranking alongside ai evaluation pipeline (ragas/langsmith/trulens). Also notable: modern python backend framework (fastapi/django). Depth spans Python, FastAPI, PostgreSQL, Docker, Google Cloud, AWS (cloud 11.0/15, GitHub 0.0/10). Activity: No public GitHub profile provided. Interview focus should be no explicit testing (pytest/unit tests) mentioned, but overall internship readiness is high.</w:t>
+        <w:t>Evaluation Notes: Arunima’s portfolio reveals a sophisticated grasp of stateful multi-agent orchestration via LangGraph, a standout capability for complex AI workflows. Her backend architecture leverages Python, FastAPI, and PostgreSQL, demonstrating solid full-stack integration with Docker and cloud providers. However, the absence of a public GitHub profile hinders direct code review, while limited evidence of Redis caching or explicit pytest unit tests suggests a gap in production-readiness. This profile fits our SDE AI internship, requiring mentorship to bridge the delta between prototype complexity and rigorous, testable engineering standards.</w:t>
         <w:br/>
       </w:r>
     </w:p>
@@ -2272,7 +2446,7 @@
         <w:pStyle w:val="Heading2"/>
       </w:pPr>
       <w:r>
-        <w:t>#6 - Abhinav Mishra (73.5/100)</w:t>
+        <w:t>#12 - Abhinav Mishra (73.5/100)</w:t>
       </w:r>
     </w:p>
     <w:p>
@@ -2292,7 +2466,7 @@
         <w:br/>
       </w:r>
       <w:r>
-        <w:t>Evaluation Notes: Abhinav’s 3.4-year GitHub tenure reveals a veteran builder with 28 original repositories, proving sustained commitment beyond typical intern portfolios. His technical depth shines through stateful multi-agent orchestration using LangGraph and robust RAG pipelines, anchored by a modern FastAPI and PostgreSQL backend. The cloud_fullstack score indicates a minor gap in enterprise Azure deployment, though his Python and Redis proficiency mitigates this. This blend of architectural maturity and practical AI implementation makes him an immediate, low-risk asset for our engineering team.</w:t>
+        <w:t>Evaluation Notes: Abhinav’s portfolio reveals a seasoned builder with 3.4 years of consistent output, including 61 repositories and 4,315 contributions last year. His technical core is anchored in a modern Python backend using FastAPI, PostgreSQL, and Redis, complemented by sophisticated stateful multi-agent orchestration via LangGraph. This combination of robust API design and advanced RAG implementation demonstrates rare depth for an intern. With no major gaps identified, his proven engineering discipline and broad Azure experience make him an immediate, high-value addition to our AI infrastructure team.</w:t>
         <w:br/>
       </w:r>
     </w:p>
@@ -2301,7 +2475,7 @@
         <w:pStyle w:val="Heading2"/>
       </w:pPr>
       <w:r>
-        <w:t>#7 - Hari Shanker Sharma (73.5/100)</w:t>
+        <w:t>#13 - Jyandeep Baishya (73.0/100)</w:t>
       </w:r>
     </w:p>
     <w:p>
@@ -2309,19 +2483,19 @@
         <w:rPr>
           <w:b/>
         </w:rPr>
-        <w:t>Contact: harishankersharma648@gmail.com | +91 8801109700 | Resume: candidate_41.pdf</w:t>
+        <w:t>Contact: craftzyan@gmail.com | 6002590335 | Resume: candidate_07.pdf</w:t>
         <w:br/>
       </w:r>
       <w:r>
-        <w:t>Score Breakdown: AI Depth: 29.0 | Python: 27.0 | Cloud: 14.0 | GitHub: 0.0 | Eng: 3.5</w:t>
+        <w:t>Score Breakdown: AI Depth: 33.0 | Python: 22.0 | Cloud: 8.0 | GitHub: 10.0 | Eng: 0.0</w:t>
         <w:br/>
       </w:r>
       <w:r>
-        <w:t>GitHub: Unverified (Rate Limited) (0.0 yrs, 0 repos, 0 contributions, 0 PRs)</w:t>
+        <w:t>GitHub: Veteran Builder (3.4 yrs, 45 repos, 490 contributions, 0 PRs)</w:t>
         <w:br/>
       </w:r>
       <w:r>
-        <w:t>Evaluation Notes: Hari Shanker Sharma scored 73.5/100 (AI 29.0/40, Python 27.0/30, Cloud 14.0/15, GitHub 0.0/10), led by distributed task queues (celery/rabbitmq/kafka) and stateful multi-agent orchestration (langgraph/crewai/autogen) Backed by vector database retrieval (chromadb/faiss/pinecone/qdrant). Stack centers on Python, FastAPI, PostgreSQL, Redis. GitHub: GitHub API rate limit exceeded; skipped enrichment. Watch-item: low or dormant public github activity. Fit for SDE AI internship is strong on shipped agentic depth.</w:t>
+        <w:t>Evaluation Notes: Jyandeep Baishya’s profile reveals a committed builder, evidenced by 45 repositories and 490 annual contributions. His technical foundation is solid, leveraging Python, FastAPI, and Redis to construct robust backend systems. He effectively integrates LangChain, LangGraph, and ChromaDB to deploy RAG pipelines and multi-agent workflows. While his GitHub history demonstrates consistent, original work, the absence of explicit testing frameworks like pytest remains a notable gap. This candidate is ready to contribute to our AI infrastructure, requiring mentorship to rigorize quality assurance practices during the internship.</w:t>
         <w:br/>
       </w:r>
     </w:p>
@@ -2330,7 +2504,7 @@
         <w:pStyle w:val="Heading2"/>
       </w:pPr>
       <w:r>
-        <w:t>#8 - Sumaiya Sultana Shaik (72.5/100)</w:t>
+        <w:t>#14 - Nevil Jasmin Mehta (70.5/100)</w:t>
       </w:r>
     </w:p>
     <w:p>
@@ -2338,19 +2512,19 @@
         <w:rPr>
           <w:b/>
         </w:rPr>
-        <w:t>Contact: sultanasumaiya623@gmail.com | +91 97015 28467 | Resume: candidate_28.pdf</w:t>
+        <w:t>Contact: nevilmehta5@gmail.com | +91-8347062282 | Resume: candidate_50.pdf</w:t>
         <w:br/>
       </w:r>
       <w:r>
-        <w:t>Score Breakdown: AI Depth: 31.0 | Python: 23.0 | Cloud: 15.0 | GitHub: 0.0 | Eng: 3.5</w:t>
+        <w:t>Score Breakdown: AI Depth: 18.0 | Python: 27.0 | Cloud: 14.0 | GitHub: 10.0 | Eng: 1.5</w:t>
         <w:br/>
       </w:r>
       <w:r>
-        <w:t>GitHub: Unverified (Rate Limited) (0.0 yrs, 0 repos, 0 contributions, 0 PRs)</w:t>
+        <w:t>GitHub: Veteran Builder (6.9 yrs, 19 repos, 250 contributions, 0 PRs)</w:t>
         <w:br/>
       </w:r>
       <w:r>
-        <w:t>Evaluation Notes: Sumaiya Sultana Shaik demonstrates promising architectural instincts through stateful multi-agent orchestration using LangGraph and CrewAI, paired with a solid FastAPI and PostgreSQL backend. Her experience integrating RAG pipelines with Docker and GCP shows practical fullstack capability. However, her public GitHub activity is currently dormant or inaccessible due to API limits, obscuring her broader engineering depth. The primary gap is a lack of evidence for Redis caching or performance optimization. Despite these unknowns, her core AI backend skills align well with our intern needs, warranting a technical interview to validate her hands-on proficiency.</w:t>
+        <w:t>Evaluation Notes: At 70.5/100, Nevil Jasmin Mehta stands out through async fastapi backend architecture, complemented by postgresql with orm / schema migrations. Plus redis caching / in-memory store rounds out the build. Core evidence in Python, FastAPI, Django, Flask, PostgreSQL maps to AI 18.0 and Python 27.0 bands. GitHub profile: Veteran Builder (6.9 yrs on GitHub, 19 repos [19 original], 250 contributions in past year [0 commits]). 15 relevant Python/AI repositories identified. Growth edge to probe in interview: no explicit testing (pytest/unit tests) mentioned.</w:t>
         <w:br/>
       </w:r>
     </w:p>
@@ -2359,7 +2533,7 @@
         <w:pStyle w:val="Heading2"/>
       </w:pPr>
       <w:r>
-        <w:t>#9 - Arjun Kumar (71.5/100)</w:t>
+        <w:t>#15 - Krishan Kant (70.0/100)</w:t>
       </w:r>
     </w:p>
     <w:p>
@@ -2367,19 +2541,19 @@
         <w:rPr>
           <w:b/>
         </w:rPr>
-        <w:t>Contact: roy.prajapat.143@gmail.com | +91-6396303191 | Resume: candidate_08.pdf</w:t>
+        <w:t>Contact: krishankantptu@gmail.com | +91-6204142591 | Resume: candidate_09.pdf</w:t>
         <w:br/>
       </w:r>
       <w:r>
-        <w:t>Score Breakdown: AI Depth: 35.0 | Python: 25.0 | Cloud: 8.0 | GitHub: 0.0 | Eng: 3.5</w:t>
+        <w:t>Score Breakdown: AI Depth: 23.0 | Python: 25.0 | Cloud: 10.0 | GitHub: 9.0 | Eng: 3.0</w:t>
         <w:br/>
       </w:r>
       <w:r>
-        <w:t>GitHub: Unverified (Rate Limited) (0.0 yrs, 0 repos, 0 contributions, 0 PRs)</w:t>
+        <w:t>GitHub: Veteran Builder (4.0 yrs, 21 repos, 21 contributions, 0 PRs)</w:t>
         <w:br/>
       </w:r>
       <w:r>
-        <w:t>Evaluation Notes: At 71.5/100, Arjun Kumar stands out through automated testing / ci/cd pipeline, complemented by observability and concurrency handling. Plus stateful multi-agent orchestration (langgraph/crewai/autogen) rounds out the build. Core evidence in Python, FastAPI, Django, PostgreSQL, AWS maps to AI 35.0 and Python 25.0 bands. GitHub profile: GitHub API rate limit exceeded; skipped enrichment. Growth edge to probe in interview: limited redis or backend caching evidence.</w:t>
+        <w:t>Evaluation Notes: Krishan’s four-year GitHub tenure reveals a builder’s mindset, anchored by two relevant Python/AI repositories. His strongest signal is an agentic workflow leveraging LangChain and OpenAI for function calling, paired with a robust embeddings-based retrieval system using PostgreSQL and Redis. While the stack is solid, the absence of explicit pytest unit tests hints at a need for rigorous engineering discipline. This gap, however, is exactly what our internship program targets, offering him the structured mentorship to refine his RAG pipelines into production-grade, testable code.</w:t>
         <w:br/>
       </w:r>
     </w:p>
@@ -2388,94 +2562,7 @@
         <w:pStyle w:val="Heading2"/>
       </w:pPr>
       <w:r>
-        <w:t>#10 - Kiran Naregal (70.5/100)</w:t>
-      </w:r>
-    </w:p>
-    <w:p>
-      <w:r>
-        <w:rPr>
-          <w:b/>
-        </w:rPr>
-        <w:t>Contact: kirnaregal7@gmail.com | 9964923041 | Resume: candidate_47.pdf</w:t>
-        <w:br/>
-      </w:r>
-      <w:r>
-        <w:t>Score Breakdown: AI Depth: 35.0 | Python: 20.0 | Cloud: 14.0 | GitHub: 0.0 | Eng: 1.5</w:t>
-        <w:br/>
-      </w:r>
-      <w:r>
-        <w:t>GitHub: Unverified (Rate Limited) (0.0 yrs, 0 repos, 0 contributions, 0 PRs)</w:t>
-        <w:br/>
-      </w:r>
-      <w:r>
-        <w:t>Evaluation Notes: Kiran Naregal scored 70.5/100 (AI 35.0/40, Python 20.0/30, Cloud 14.0/15, GitHub 0.0/10), led by observability and concurrency handling and stateful multi-agent orchestration (langgraph/crewai/autogen) Backed by embeddings-based retrieval system. Stack centers on Python, FastAPI, Docker, AWS. GitHub: GitHub API rate limit exceeded; skipped enrichment. Watch-item: limited redis or backend caching evidence. Fit for SDE AI internship is strong on shipped agentic depth.</w:t>
-        <w:br/>
-      </w:r>
-    </w:p>
-    <w:p>
-      <w:pPr>
-        <w:pStyle w:val="Heading2"/>
-      </w:pPr>
-      <w:r>
-        <w:t>#11 - Vivek Chimnani (68.5/100)</w:t>
-      </w:r>
-    </w:p>
-    <w:p>
-      <w:r>
-        <w:rPr>
-          <w:b/>
-        </w:rPr>
-        <w:t>Contact: vivekchimnani4231@gmail.com | N/A | Resume: candidate_44.pdf</w:t>
-        <w:br/>
-      </w:r>
-      <w:r>
-        <w:t>Score Breakdown: AI Depth: 24.0 | Python: 27.0 | Cloud: 14.0 | GitHub: 0.0 | Eng: 3.5</w:t>
-        <w:br/>
-      </w:r>
-      <w:r>
-        <w:t>GitHub: Unverified (Rate Limited) (0.0 yrs, 0 repos, 0 contributions, 0 PRs)</w:t>
-        <w:br/>
-      </w:r>
-      <w:r>
-        <w:t>Evaluation Notes: At 68.5/100, Vivek Chimnani stands out through automated testing / ci/cd pipeline, complemented by observability and concurrency handling. Plus stateful multi-agent orchestration (langgraph/crewai/autogen) rounds out the build. Core evidence in Python, FastAPI, PostgreSQL, Redis, Docker maps to AI 24.0 and Python 27.0 bands. GitHub profile: GitHub API rate limit exceeded; skipped enrichment. Growth edge to probe in interview: low or dormant public github activity.</w:t>
-        <w:br/>
-      </w:r>
-    </w:p>
-    <w:p>
-      <w:pPr>
-        <w:pStyle w:val="Heading2"/>
-      </w:pPr>
-      <w:r>
-        <w:t>#12 - Yash Maini (68.0/100)</w:t>
-      </w:r>
-    </w:p>
-    <w:p>
-      <w:r>
-        <w:rPr>
-          <w:b/>
-        </w:rPr>
-        <w:t>Contact: mainiyash2@gmail.com | +91-8920028757 | Resume: candidate_13.pdf</w:t>
-        <w:br/>
-      </w:r>
-      <w:r>
-        <w:t>Score Breakdown: AI Depth: 33.0 | Python: 22.0 | Cloud: 11.0 | GitHub: 0.0 | Eng: 2.0</w:t>
-        <w:br/>
-      </w:r>
-      <w:r>
-        <w:t>GitHub: Unverified (Rate Limited) (0.0 yrs, 0 repos, 0 contributions, 0 PRs)</w:t>
-        <w:br/>
-      </w:r>
-      <w:r>
-        <w:t>Evaluation Notes: Yash Maini scored 68.0/100 (AI 33.0/40, Python 22.0/30, Cloud 11.0/15, GitHub 0.0/10), led by automated testing / ci/cd pipeline and stateful multi-agent orchestration (langgraph/crewai/autogen) Backed by vector database retrieval (chromadb/faiss/pinecone/qdrant). Stack centers on Python, FastAPI, Flask, PostgreSQL. GitHub: GitHub API rate limit exceeded; skipped enrichment. Watch-item: limited redis or backend caching evidence. Fit for SDE AI internship is strong on shipped agentic depth.</w:t>
-        <w:br/>
-      </w:r>
-    </w:p>
-    <w:p>
-      <w:pPr>
-        <w:pStyle w:val="Heading2"/>
-      </w:pPr>
-      <w:r>
-        <w:t>#13 - Prajwal A S (68.0/100)</w:t>
+        <w:t>#16 - Prajwal A S (68.0/100)</w:t>
       </w:r>
     </w:p>
     <w:p>
@@ -2504,7 +2591,7 @@
         <w:pStyle w:val="Heading2"/>
       </w:pPr>
       <w:r>
-        <w:t>#14 - Jyandeep Baishya (63.0/100)</w:t>
+        <w:t>#17 - Priyanshu Kumar (63.0/100)</w:t>
       </w:r>
     </w:p>
     <w:p>
@@ -2512,19 +2599,19 @@
         <w:rPr>
           <w:b/>
         </w:rPr>
-        <w:t>Contact: craftzyan@gmail.com | 6002590335 | Resume: candidate_07.pdf</w:t>
+        <w:t>Contact: krpriyanshu2805@gmail.com | +91 8210008947 | Resume: candidate_16.pdf</w:t>
         <w:br/>
       </w:r>
       <w:r>
-        <w:t>Score Breakdown: AI Depth: 33.0 | Python: 22.0 | Cloud: 8.0 | GitHub: 0.0 | Eng: 0.0</w:t>
+        <w:t>Score Breakdown: AI Depth: 28.0 | Python: 22.0 | Cloud: 4.0 | GitHub: 7.5 | Eng: 1.5</w:t>
         <w:br/>
       </w:r>
       <w:r>
-        <w:t>GitHub: Unverified (Rate Limited) (0.0 yrs, 0 repos, 0 contributions, 0 PRs)</w:t>
+        <w:t>GitHub: Veteran Builder (3.3 yrs, 13 repos, 5 contributions, 0 PRs)</w:t>
         <w:br/>
       </w:r>
       <w:r>
-        <w:t>Evaluation Notes: At 63.0/100, Jyandeep Baishya stands out through cloud infrastructure (aws/azure), complemented by full stack capability (react/next.js/typescript). Plus stateful multi-agent orchestration (langgraph/crewai/autogen) rounds out the build. Core evidence in Python, FastAPI, Redis, LangChain, LangGraph maps to AI 33.0 and Python 22.0 bands. GitHub profile: GitHub API rate limit exceeded; skipped enrichment. Growth edge to probe in interview: low or dormant public github activity.</w:t>
+        <w:t>Evaluation Notes: Priyanshu Kumar (63.0/100) impressed with full stack capability (react/next.js/typescript) alongside strong public github footprint (veteran builder). Also notable: distributed task queues (celery/rabbitmq/kafka). Depth spans Python, FastAPI, PostgreSQL, LangChain, LangGraph, RAG (cloud 4.0/15, GitHub 7.5/10). Activity: Veteran Builder (3.3 yrs on GitHub, 13 repos [9 original], 5 contributions in past year [0 commits]). 7 relevant Python/AI repositories identified. Interview focus should be limited redis or backend caching evidence, but overall internship readiness is high.</w:t>
         <w:br/>
       </w:r>
     </w:p>
@@ -2533,7 +2620,36 @@
         <w:pStyle w:val="Heading2"/>
       </w:pPr>
       <w:r>
-        <w:t>#15 - M Sai Kushith (61.0/100)</w:t>
+        <w:t>#18 - P V Jayavardhana Sai (62.0/100)</w:t>
+      </w:r>
+    </w:p>
+    <w:p>
+      <w:r>
+        <w:rPr>
+          <w:b/>
+        </w:rPr>
+        <w:t>Contact: pvjayavardhan6@gmail.com | +91 99663 46173 | Resume: candidate_19.pdf</w:t>
+        <w:br/>
+      </w:r>
+      <w:r>
+        <w:t>Score Breakdown: AI Depth: 22.0 | Python: 17.0 | Cloud: 14.0 | GitHub: 7.5 | Eng: 1.5</w:t>
+        <w:br/>
+      </w:r>
+      <w:r>
+        <w:t>GitHub: Veteran Builder (3.7 yrs, 8 repos, 3 contributions, 0 PRs)</w:t>
+        <w:br/>
+      </w:r>
+      <w:r>
+        <w:t>Evaluation Notes: P V Jayavardhana Sai (62.0/100) impressed with ai evaluation pipeline (ragas/langsmith/trulens) alongside modern python backend framework (fastapi/django). Also notable: docker containerization &amp; deployment. Depth spans Python, Flask, Docker, AWS, RAG, Ollama (cloud 14.0/15, GitHub 7.5/10). Activity: Veteran Builder (3.7 yrs on GitHub, 8 repos [8 original], 3 contributions in past year [0 commits], 1 stars). 5 relevant Python/AI repositories identified. Interview focus should be limited redis or backend caching evidence, but overall internship readiness is high.</w:t>
+        <w:br/>
+      </w:r>
+    </w:p>
+    <w:p>
+      <w:pPr>
+        <w:pStyle w:val="Heading2"/>
+      </w:pPr>
+      <w:r>
+        <w:t>#19 - M Sai Kushith (61.0/100)</w:t>
       </w:r>
     </w:p>
     <w:p>
@@ -2553,7 +2669,7 @@
         <w:br/>
       </w:r>
       <w:r>
-        <w:t>Evaluation Notes: At 61.0/100, M Sai Kushith stands out through full stack capability (react/next.js/typescript), complemented by stateful multi-agent orchestration (langgraph/crewai/autogen). Plus embeddings-based retrieval system rounds out the build. Core evidence in Python, FastAPI, Django, PostgreSQL, LangChain maps to AI 31.0 and Python 20.0 bands. GitHub profile: Active Builder (1.3 yrs on GitHub, 4 repos [4 original], 1 contributions in past year [0 commits]). 1 relevant Python/AI repositories identified. Growth edge to probe in interview: no explicit testing (pytest/unit tests) mentioned.</w:t>
+        <w:t>Evaluation Notes: M Sai Kushith’s portfolio reveals a promising trajectory, anchored by one relevant Python/AI repository demonstrating RAG capabilities via LangChain and LangGraph. While the backend infrastructure is minimal, the integration of PostgreSQL suggests foundational database literacy. However, the 1.3-year GitHub history with only four total repositories indicates limited sustained engineering output. The absence of explicit testing practices or Redis caching remains a critical gap. Despite these shortcomings, the niche focus on retrieval systems warrants a junior internship to build robust backend discipline.</w:t>
         <w:br/>
       </w:r>
     </w:p>
@@ -2562,65 +2678,7 @@
         <w:pStyle w:val="Heading2"/>
       </w:pPr>
       <w:r>
-        <w:t>#16 - Krishan Kant (61.0/100)</w:t>
-      </w:r>
-    </w:p>
-    <w:p>
-      <w:r>
-        <w:rPr>
-          <w:b/>
-        </w:rPr>
-        <w:t>Contact: krishankantptu@gmail.com | +91-6204142591 | Resume: candidate_09.pdf</w:t>
-        <w:br/>
-      </w:r>
-      <w:r>
-        <w:t>Score Breakdown: AI Depth: 23.0 | Python: 25.0 | Cloud: 10.0 | GitHub: 0.0 | Eng: 3.0</w:t>
-        <w:br/>
-      </w:r>
-      <w:r>
-        <w:t>GitHub: Unverified (Rate Limited) (0.0 yrs, 0 repos, 0 contributions, 0 PRs)</w:t>
-        <w:br/>
-      </w:r>
-      <w:r>
-        <w:t>Evaluation Notes: At 61.0/100, Krishan Kant stands out through distributed task queues (celery/rabbitmq/kafka), complemented by observability and concurrency handling. Plus agentic workflow with tool/function calling rounds out the build. Core evidence in Python, PostgreSQL, Redis, Docker, LangChain maps to AI 23.0 and Python 25.0 bands. GitHub profile: GitHub API rate limit exceeded; skipped enrichment. Growth edge to probe in interview: low or dormant public github activity.</w:t>
-        <w:br/>
-      </w:r>
-    </w:p>
-    <w:p>
-      <w:pPr>
-        <w:pStyle w:val="Heading2"/>
-      </w:pPr>
-      <w:r>
-        <w:t>#17 - Nevil Jasmin Mehta (60.5/100)</w:t>
-      </w:r>
-    </w:p>
-    <w:p>
-      <w:r>
-        <w:rPr>
-          <w:b/>
-        </w:rPr>
-        <w:t>Contact: nevilmehta5@gmail.com | +91-8347062282 | Resume: candidate_50.pdf</w:t>
-        <w:br/>
-      </w:r>
-      <w:r>
-        <w:t>Score Breakdown: AI Depth: 18.0 | Python: 27.0 | Cloud: 14.0 | GitHub: 0.0 | Eng: 1.5</w:t>
-        <w:br/>
-      </w:r>
-      <w:r>
-        <w:t>GitHub: Unverified (Rate Limited) (0.0 yrs, 0 repos, 0 contributions, 0 PRs)</w:t>
-        <w:br/>
-      </w:r>
-      <w:r>
-        <w:t>Evaluation Notes: Nevil Jasmin Mehta (60.5/100) impressed with vector database retrieval (chromadb/faiss/pinecone/qdrant) alongside async fastapi backend architecture. Also notable: postgresql with orm / schema migrations. Depth spans Python, FastAPI, Django, Flask, PostgreSQL, Redis (cloud 14.0/15, GitHub 0.0/10). Activity: GitHub API rate limit exceeded; skipped enrichment. Interview focus should be low or dormant public github activity, but overall internship readiness is high.</w:t>
-        <w:br/>
-      </w:r>
-    </w:p>
-    <w:p>
-      <w:pPr>
-        <w:pStyle w:val="Heading2"/>
-      </w:pPr>
-      <w:r>
-        <w:t>#18 - Thejeshwaar Paasila (59.5/100)</w:t>
+        <w:t>#20 - Thejeshwaar Paasila (59.5/100)</w:t>
       </w:r>
     </w:p>
     <w:p>
@@ -2641,64 +2699,6 @@
       </w:r>
       <w:r>
         <w:t>Evaluation Notes: At 59.5/100, Thejeshwaar Paasila stands out through modern python backend framework (fastapi/django), complemented by postgresql with orm / schema migrations. Plus docker containerization &amp; deployment rounds out the build. Core evidence in Python, Flask, PostgreSQL, Docker, Google Cloud maps to AI 16.0 and Python 20.0 bands. GitHub profile: Emerging Developer (2.3 yrs on GitHub, 3 repos [2 original], 10 contributions in past year [0 commits]). 1 relevant Python/AI repositories identified. Growth edge to probe in interview: limited redis or backend caching evidence.</w:t>
-        <w:br/>
-      </w:r>
-    </w:p>
-    <w:p>
-      <w:pPr>
-        <w:pStyle w:val="Heading2"/>
-      </w:pPr>
-      <w:r>
-        <w:t>#19 - Vivek Shekhawat (59.0/100)</w:t>
-      </w:r>
-    </w:p>
-    <w:p>
-      <w:r>
-        <w:rPr>
-          <w:b/>
-        </w:rPr>
-        <w:t>Contact: vivekshekhawatofficial1592002@gmail.com | +91-7734911626 | Resume: candidate_39.pdf</w:t>
-        <w:br/>
-      </w:r>
-      <w:r>
-        <w:t>Score Breakdown: AI Depth: 27.0 | Python: 23.0 | Cloud: 4.0 | GitHub: 3.5 | Eng: 1.5</w:t>
-        <w:br/>
-      </w:r>
-      <w:r>
-        <w:t>GitHub: Veteran Builder (4.1 yrs, 15 repos, 1 contributions, 0 PRs)</w:t>
-        <w:br/>
-      </w:r>
-      <w:r>
-        <w:t>Evaluation Notes: Vivek Shekhawat scored 59.0/100 (AI 27.0/40, Python 23.0/30, Cloud 4.0/15, GitHub 3.5/10), led by postgresql with orm / schema migrations and full stack capability (react/next.js/typescript) Backed by observability and concurrency handling. Stack centers on Python, Django, PostgreSQL, LangChain. GitHub: Veteran Builder (4.1 yrs on GitHub, 15 repos [0 original], 1 contributions in past year [0 commits]). 0 relevant Python/AI repositories identified. Watch-item: no explicit testing (pytest/unit tests) mentioned. Fit for SDE AI internship is strong on shipped agentic depth.</w:t>
-        <w:br/>
-      </w:r>
-    </w:p>
-    <w:p>
-      <w:pPr>
-        <w:pStyle w:val="Heading2"/>
-      </w:pPr>
-      <w:r>
-        <w:t>#20 - Pavani A (58.0/100)</w:t>
-      </w:r>
-    </w:p>
-    <w:p>
-      <w:r>
-        <w:rPr>
-          <w:b/>
-        </w:rPr>
-        <w:t>Contact: pavani10112004@gmail.com | +919742542200 | Resume: candidate_38.pdf</w:t>
-        <w:br/>
-      </w:r>
-      <w:r>
-        <w:t>Score Breakdown: AI Depth: 20.0 | Python: 20.0 | Cloud: 10.0 | GitHub: 6.0 | Eng: 2.0</w:t>
-        <w:br/>
-      </w:r>
-      <w:r>
-        <w:t>GitHub: Active Builder (1.9 yrs, 16 repos, 19 contributions, 0 PRs)</w:t>
-        <w:br/>
-      </w:r>
-      <w:r>
-        <w:t>Evaluation Notes: At 58.0/100, Pavani A stands out through postgresql with orm / schema migrations, complemented by docker containerization &amp; deployment. Plus full stack capability (react/next.js/typescript) rounds out the build. Core evidence in Python, FastAPI, Django, Flask, PostgreSQL maps to AI 20.0 and Python 20.0 bands. GitHub profile: Active Builder (1.9 yrs on GitHub, 16 repos [0 original], 19 contributions in past year [0 commits]). 0 relevant Python/AI repositories identified. Growth edge to probe in interview: limited redis or backend caching evidence.</w:t>
         <w:br/>
       </w:r>
     </w:p>

</xml_diff>